<commit_message>
Add reference method and backtest review documentation, implement portfolio simulator, and enhance tests
- Created `reports/reference_method_backtest_review.md` to document findings on the kvant pipeline and its backtesting methodology.
- Introduced `portfolio_simulator.py` to simulate cash/exposure constrained portfolios and compute performance metrics.
- Added tests for the labeling functions in `test_labelling.py` to ensure correct behavior of triple barrier labeling.
- Implemented tests in `test_portfolio_simulator.py` to validate portfolio metrics calculations and transaction cost applications.
- Developed tests in `test_samplers.py` for the Fixed Threshold CUSUM Bar Sampler to ensure correct sampling behavior and parameter handling.
</commit_message>
<xml_diff>
--- a/reports/Kvant_Project_Description.docx
+++ b/reports/Kvant_Project_Description.docx
@@ -8,28 +8,12 @@
       </w:pPr>
       <w:r>
         <w:rPr>
-          <w:rFonts w:ascii="Aptos Display" w:hAnsi="Aptos Display"/>
+          <w:rFonts w:ascii="Aptos" w:hAnsi="Aptos" w:eastAsia="Aptos"/>
           <w:b/>
           <w:color w:val="1F4E79"/>
-          <w:sz w:val="68"/>
+          <w:sz w:val="60"/>
         </w:rPr>
         <w:t>Kvant</w:t>
-      </w:r>
-    </w:p>
-    <w:p>
-      <w:pPr>
-        <w:jc w:val="center"/>
-        <w:pBdr>
-          <w:bottom w:val="single" w:sz="12" w:space="4" w:color="1F4E79"/>
-        </w:pBdr>
-      </w:pPr>
-      <w:r>
-        <w:rPr>
-          <w:rFonts w:ascii="Aptos Display" w:hAnsi="Aptos Display"/>
-          <w:color w:val="2E5466"/>
-          <w:sz w:val="44"/>
-        </w:rPr>
-        <w:t>Project Description</w:t>
       </w:r>
     </w:p>
     <w:p>
@@ -38,182 +22,1477 @@
       </w:pPr>
       <w:r>
         <w:rPr>
-          <w:rFonts w:ascii="Aptos" w:hAnsi="Aptos"/>
-          <w:i/>
-          <w:color w:val="4B5563"/>
-          <w:sz w:val="24"/>
+          <w:rFonts w:ascii="Aptos" w:hAnsi="Aptos" w:eastAsia="Aptos"/>
+          <w:color w:val="2F5597"/>
+          <w:sz w:val="32"/>
         </w:rPr>
-        <w:t>A reproducible machine-learning research pipeline for short-horizon US equity trading</w:t>
+        <w:t>Detailed Project Description</w:t>
       </w:r>
     </w:p>
-    <w:p/>
+    <w:p>
+      <w:pPr>
+        <w:jc w:val="center"/>
+      </w:pPr>
+      <w:r>
+        <w:rPr>
+          <w:rFonts w:ascii="Aptos" w:hAnsi="Aptos" w:eastAsia="Aptos"/>
+        </w:rPr>
+        <w:t>A reproducible research pipeline for short-horizon US equity trading using minute-level features, event sampling, triple-barrier labels, side prediction, meta-label trade filtering, and budget-constrained portfolio evaluation.</w:t>
+      </w:r>
+    </w:p>
     <w:tbl>
       <w:tblPr>
+        <w:tblStyle w:val="TableGrid"/>
         <w:tblW w:type="auto" w:w="0"/>
         <w:jc w:val="center"/>
         <w:tblLook w:firstColumn="1" w:firstRow="1" w:lastColumn="0" w:lastRow="0" w:noHBand="0" w:noVBand="1" w:val="04A0"/>
       </w:tblPr>
       <w:tblGrid>
-        <w:gridCol w:w="3324"/>
-        <w:gridCol w:w="3324"/>
-        <w:gridCol w:w="3324"/>
+        <w:gridCol w:w="5040"/>
+        <w:gridCol w:w="5040"/>
       </w:tblGrid>
       <w:tr>
         <w:tc>
           <w:tcPr>
-            <w:tcW w:type="dxa" w:w="3324"/>
-            <w:shd w:fill="EAF3F8"/>
-            <w:tcBorders>
-              <w:top w:val="single" w:sz="4" w:space="0" w:color="D9E2EC"/>
-              <w:left w:val="single" w:sz="4" w:space="0" w:color="D9E2EC"/>
-              <w:bottom w:val="single" w:sz="4" w:space="0" w:color="D9E2EC"/>
-              <w:right w:val="single" w:sz="4" w:space="0" w:color="D9E2EC"/>
-            </w:tcBorders>
+            <w:tcW w:type="dxa" w:w="2448"/>
+            <w:vAlign w:val="center"/>
+            <w:shd w:fill="1F4E79"/>
           </w:tcPr>
           <w:p>
             <w:pPr>
-              <w:jc w:val="center"/>
+              <w:spacing w:after="0"/>
             </w:pPr>
+            <w:r/>
             <w:r>
               <w:rPr>
-                <w:rFonts w:ascii="Aptos" w:hAnsi="Aptos"/>
                 <w:b/>
-                <w:color w:val="1F4E79"/>
-                <w:sz w:val="17"/>
+                <w:color w:val="FFFFFF"/>
               </w:rPr>
-              <w:t>Current Approach</w:t>
-              <w:br/>
-            </w:r>
-            <w:r>
-              <w:rPr>
-                <w:rFonts w:ascii="Aptos Display" w:hAnsi="Aptos Display"/>
-                <w:b/>
-                <w:sz w:val="22"/>
-              </w:rPr>
-              <w:t>Side + meta-labeling</w:t>
+              <w:t>Current approach</w:t>
             </w:r>
           </w:p>
         </w:tc>
         <w:tc>
           <w:tcPr>
-            <w:tcW w:type="dxa" w:w="3324"/>
-            <w:shd w:fill="EAF3F8"/>
-            <w:tcBorders>
-              <w:top w:val="single" w:sz="4" w:space="0" w:color="D9E2EC"/>
-              <w:left w:val="single" w:sz="4" w:space="0" w:color="D9E2EC"/>
-              <w:bottom w:val="single" w:sz="4" w:space="0" w:color="D9E2EC"/>
-              <w:right w:val="single" w:sz="4" w:space="0" w:color="D9E2EC"/>
-            </w:tcBorders>
+            <w:tcW w:type="dxa" w:w="8064"/>
+            <w:vAlign w:val="center"/>
+            <w:shd w:fill="1F4E79"/>
           </w:tcPr>
           <w:p>
             <w:pPr>
-              <w:jc w:val="center"/>
+              <w:spacing w:after="0"/>
             </w:pPr>
+            <w:r/>
             <w:r>
               <w:rPr>
-                <w:rFonts w:ascii="Aptos" w:hAnsi="Aptos"/>
                 <w:b/>
-                <w:color w:val="1F4E79"/>
-                <w:sz w:val="17"/>
+                <w:color w:val="FFFFFF"/>
               </w:rPr>
-              <w:t>Data Unit</w:t>
-              <w:br/>
+              <w:t>Status</w:t>
             </w:r>
+          </w:p>
+        </w:tc>
+      </w:tr>
+      <w:tr>
+        <w:tc>
+          <w:tcPr>
+            <w:tcW w:type="dxa" w:w="2448"/>
+            <w:vAlign w:val="center"/>
+          </w:tcPr>
+          <w:p>
+            <w:pPr>
+              <w:spacing w:after="0"/>
+            </w:pPr>
+            <w:r/>
             <w:r>
               <w:rPr>
-                <w:rFonts w:ascii="Aptos Display" w:hAnsi="Aptos Display"/>
-                <w:b/>
-                <w:sz w:val="22"/>
+                <w:b w:val="0"/>
               </w:rPr>
-              <w:t>Minute OHLCV event bars</w:t>
+              <w:t>Data</w:t>
             </w:r>
           </w:p>
         </w:tc>
         <w:tc>
           <w:tcPr>
-            <w:tcW w:type="dxa" w:w="3324"/>
-            <w:shd w:fill="EAF3F8"/>
-            <w:tcBorders>
-              <w:top w:val="single" w:sz="4" w:space="0" w:color="D9E2EC"/>
-              <w:left w:val="single" w:sz="4" w:space="0" w:color="D9E2EC"/>
-              <w:bottom w:val="single" w:sz="4" w:space="0" w:color="D9E2EC"/>
-              <w:right w:val="single" w:sz="4" w:space="0" w:color="D9E2EC"/>
-            </w:tcBorders>
+            <w:tcW w:type="dxa" w:w="8064"/>
+            <w:vAlign w:val="center"/>
           </w:tcPr>
           <w:p>
             <w:pPr>
-              <w:jc w:val="center"/>
+              <w:spacing w:after="0"/>
             </w:pPr>
+            <w:r/>
             <w:r>
               <w:rPr>
-                <w:rFonts w:ascii="Aptos" w:hAnsi="Aptos"/>
-                <w:b/>
-                <w:color w:val="1F4E79"/>
-                <w:sz w:val="17"/>
+                <w:b w:val="0"/>
               </w:rPr>
-              <w:t>Research Focus</w:t>
-              <w:br/>
+              <w:t>Minute-level US equity OHLCV with walk-forward train/validation/test folds.</w:t>
             </w:r>
+          </w:p>
+        </w:tc>
+      </w:tr>
+      <w:tr>
+        <w:tc>
+          <w:tcPr>
+            <w:tcW w:type="dxa" w:w="2448"/>
+            <w:vAlign w:val="center"/>
+          </w:tcPr>
+          <w:p>
+            <w:pPr>
+              <w:spacing w:after="0"/>
+            </w:pPr>
+            <w:r/>
             <w:r>
               <w:rPr>
-                <w:rFonts w:ascii="Aptos Display" w:hAnsi="Aptos Display"/>
-                <w:b/>
-                <w:sz w:val="22"/>
+                <w:b w:val="0"/>
               </w:rPr>
-              <w:t>Trade decisions under costs</w:t>
+              <w:t>Preparation</w:t>
+            </w:r>
+          </w:p>
+        </w:tc>
+        <w:tc>
+          <w:tcPr>
+            <w:tcW w:type="dxa" w:w="8064"/>
+            <w:vAlign w:val="center"/>
+          </w:tcPr>
+          <w:p>
+            <w:pPr>
+              <w:spacing w:after="0"/>
+            </w:pPr>
+            <w:r/>
+            <w:r>
+              <w:rPr>
+                <w:b w:val="0"/>
+              </w:rPr>
+              <w:t>Features are computed before event sampling; learned preparation state is fitted on train data only.</w:t>
+            </w:r>
+          </w:p>
+        </w:tc>
+      </w:tr>
+      <w:tr>
+        <w:tc>
+          <w:tcPr>
+            <w:tcW w:type="dxa" w:w="2448"/>
+            <w:vAlign w:val="center"/>
+          </w:tcPr>
+          <w:p>
+            <w:pPr>
+              <w:spacing w:after="0"/>
+            </w:pPr>
+            <w:r/>
+            <w:r>
+              <w:rPr>
+                <w:b w:val="0"/>
+              </w:rPr>
+              <w:t>Labels</w:t>
+            </w:r>
+          </w:p>
+        </w:tc>
+        <w:tc>
+          <w:tcPr>
+            <w:tcW w:type="dxa" w:w="8064"/>
+            <w:vAlign w:val="center"/>
+          </w:tcPr>
+          <w:p>
+            <w:pPr>
+              <w:spacing w:after="0"/>
+            </w:pPr>
+            <w:r/>
+            <w:r>
+              <w:rPr>
+                <w:b w:val="0"/>
+              </w:rPr>
+              <w:t>Raw event_outcome labels are retained as down, exit, and up.</w:t>
+            </w:r>
+          </w:p>
+        </w:tc>
+      </w:tr>
+      <w:tr>
+        <w:tc>
+          <w:tcPr>
+            <w:tcW w:type="dxa" w:w="2448"/>
+            <w:vAlign w:val="center"/>
+          </w:tcPr>
+          <w:p>
+            <w:pPr>
+              <w:spacing w:after="0"/>
+            </w:pPr>
+            <w:r/>
+            <w:r>
+              <w:rPr>
+                <w:b w:val="0"/>
+              </w:rPr>
+              <w:t>Execution timing</w:t>
+            </w:r>
+          </w:p>
+        </w:tc>
+        <w:tc>
+          <w:tcPr>
+            <w:tcW w:type="dxa" w:w="8064"/>
+            <w:vAlign w:val="center"/>
+          </w:tcPr>
+          <w:p>
+            <w:pPr>
+              <w:spacing w:after="0"/>
+            </w:pPr>
+            <w:r/>
+            <w:r>
+              <w:rPr>
+                <w:b w:val="0"/>
+              </w:rPr>
+              <w:t>The sampled row is the signal; trades enter on the next sampled bar.</w:t>
+            </w:r>
+          </w:p>
+        </w:tc>
+      </w:tr>
+      <w:tr>
+        <w:tc>
+          <w:tcPr>
+            <w:tcW w:type="dxa" w:w="2448"/>
+            <w:vAlign w:val="center"/>
+          </w:tcPr>
+          <w:p>
+            <w:pPr>
+              <w:spacing w:after="0"/>
+            </w:pPr>
+            <w:r/>
+            <w:r>
+              <w:rPr>
+                <w:b w:val="0"/>
+              </w:rPr>
+              <w:t>Leakage control</w:t>
+            </w:r>
+          </w:p>
+        </w:tc>
+        <w:tc>
+          <w:tcPr>
+            <w:tcW w:type="dxa" w:w="8064"/>
+            <w:vAlign w:val="center"/>
+          </w:tcPr>
+          <w:p>
+            <w:pPr>
+              <w:spacing w:after="0"/>
+            </w:pPr>
+            <w:r/>
+            <w:r>
+              <w:rPr>
+                <w:b w:val="0"/>
+              </w:rPr>
+              <w:t>Label intervals crossing split boundaries are purged and embargoed.</w:t>
+            </w:r>
+          </w:p>
+        </w:tc>
+      </w:tr>
+      <w:tr>
+        <w:tc>
+          <w:tcPr>
+            <w:tcW w:type="dxa" w:w="2448"/>
+            <w:vAlign w:val="center"/>
+          </w:tcPr>
+          <w:p>
+            <w:pPr>
+              <w:spacing w:after="0"/>
+            </w:pPr>
+            <w:r/>
+            <w:r>
+              <w:rPr>
+                <w:b w:val="0"/>
+              </w:rPr>
+              <w:t>Evaluation</w:t>
+            </w:r>
+          </w:p>
+        </w:tc>
+        <w:tc>
+          <w:tcPr>
+            <w:tcW w:type="dxa" w:w="8064"/>
+            <w:vAlign w:val="center"/>
+          </w:tcPr>
+          <w:p>
+            <w:pPr>
+              <w:spacing w:after="0"/>
+            </w:pPr>
+            <w:r/>
+            <w:r>
+              <w:rPr>
+                <w:b w:val="0"/>
+              </w:rPr>
+              <w:t>W&amp;B logs side, meta, decision, execution, paper-economics, and portfolio-account metrics.</w:t>
             </w:r>
           </w:p>
         </w:tc>
       </w:tr>
     </w:tbl>
     <w:p/>
+    <w:p>
+      <w:pPr>
+        <w:pStyle w:val="Heading1"/>
+      </w:pPr>
+      <w:r>
+        <w:rPr>
+          <w:rFonts w:ascii="Aptos" w:hAnsi="Aptos" w:eastAsia="Aptos"/>
+        </w:rPr>
+        <w:t>1. Executive Summary</w:t>
+      </w:r>
+    </w:p>
+    <w:p>
+      <w:r>
+        <w:rPr>
+          <w:rFonts w:ascii="Aptos" w:hAnsi="Aptos" w:eastAsia="Aptos"/>
+        </w:rPr>
+        <w:t>Kvant is a machine-learning research project for short-horizon trading on minute-level US equity data. The project is designed around the idea that a useful trading model should not only predict direction. It should also decide whether a proposed trade is worth taking, and it should be evaluated under explicit timing, transaction-cost, overlap, and capital-allocation assumptions.</w:t>
+      </w:r>
+    </w:p>
+    <w:p>
+      <w:r>
+        <w:rPr>
+          <w:rFonts w:ascii="Aptos" w:hAnsi="Aptos" w:eastAsia="Aptos"/>
+        </w:rPr>
+        <w:t>The current pipeline follows a Lopez de Prado-inspired side-plus-meta-labeling design. Prepared artifacts keep the raw three-class triple-barrier event outcome: down, exit, and up. Training derives a binary primary side target from actionable down/up examples, trains a side classifier, and then uses a meta-label decision layer to convert proposed side predictions into TAKE or PASS decisions.</w:t>
+      </w:r>
+    </w:p>
+    <w:p>
+      <w:r>
+        <w:rPr>
+          <w:rFonts w:ascii="Aptos" w:hAnsi="Aptos" w:eastAsia="Aptos"/>
+        </w:rPr>
+        <w:t>The latest project approach makes portfolio realism a first-class evaluation layer. The older paper-style backtest remains useful as a diagnostic trade-level view, but final economic claims should use the budget-constrained portfolio simulator. That simulator tracks cash, open positions, exposure, transaction costs, skipped-budget trades, drawdown, Sharpe, and final account value.</w:t>
+      </w:r>
+    </w:p>
+    <w:p>
+      <w:pPr>
+        <w:pStyle w:val="Heading1"/>
+      </w:pPr>
+      <w:r>
+        <w:rPr>
+          <w:rFonts w:ascii="Aptos" w:hAnsi="Aptos" w:eastAsia="Aptos"/>
+        </w:rPr>
+        <w:t>2. Research Goal</w:t>
+      </w:r>
+    </w:p>
+    <w:p>
+      <w:r>
+        <w:rPr>
+          <w:rFonts w:ascii="Aptos" w:hAnsi="Aptos" w:eastAsia="Aptos"/>
+        </w:rPr>
+        <w:t>The core research question is whether event-based sampling, triple-barrier labels, and meta-label trade filtering can produce out-of-sample trading decisions that remain interpretable after costs and realistic account constraints. The project therefore treats validation accuracy as only one diagnostic, not the final objective.</w:t>
+      </w:r>
+    </w:p>
+    <w:p>
+      <w:pPr>
+        <w:pStyle w:val="ListBullet"/>
+      </w:pPr>
+      <w:r>
+        <w:rPr>
+          <w:rFonts w:ascii="Aptos" w:hAnsi="Aptos" w:eastAsia="Aptos"/>
+        </w:rPr>
+        <w:t>Primary goal: learn directional side on actionable events.</w:t>
+      </w:r>
+    </w:p>
+    <w:p>
+      <w:pPr>
+        <w:pStyle w:val="ListBullet"/>
+      </w:pPr>
+      <w:r>
+        <w:rPr>
+          <w:rFonts w:ascii="Aptos" w:hAnsi="Aptos" w:eastAsia="Aptos"/>
+        </w:rPr>
+        <w:t>Decision goal: abstain from low-quality or ambiguous predictions.</w:t>
+      </w:r>
+    </w:p>
+    <w:p>
+      <w:pPr>
+        <w:pStyle w:val="ListBullet"/>
+      </w:pPr>
+      <w:r>
+        <w:rPr>
+          <w:rFonts w:ascii="Aptos" w:hAnsi="Aptos" w:eastAsia="Aptos"/>
+        </w:rPr>
+        <w:t>Execution goal: enter only after the model signal is known and avoid overlapping same-ticker trades.</w:t>
+      </w:r>
+    </w:p>
+    <w:p>
+      <w:pPr>
+        <w:pStyle w:val="ListBullet"/>
+      </w:pPr>
+      <w:r>
+        <w:rPr>
+          <w:rFonts w:ascii="Aptos" w:hAnsi="Aptos" w:eastAsia="Aptos"/>
+        </w:rPr>
+        <w:t>Portfolio goal: simulate one finite account with position-size, exposure, and concurrent-position limits.</w:t>
+      </w:r>
+    </w:p>
+    <w:p>
+      <w:pPr>
+        <w:pStyle w:val="Heading1"/>
+      </w:pPr>
+      <w:r>
+        <w:rPr>
+          <w:rFonts w:ascii="Aptos" w:hAnsi="Aptos" w:eastAsia="Aptos"/>
+        </w:rPr>
+        <w:t>3. Current Pipeline</w:t>
+      </w:r>
+    </w:p>
     <w:tbl>
       <w:tblPr>
+        <w:tblStyle w:val="TableGrid"/>
         <w:tblW w:type="auto" w:w="0"/>
         <w:jc w:val="center"/>
-        <w:tblLayout w:type="autofit"/>
         <w:tblLook w:firstColumn="1" w:firstRow="1" w:lastColumn="0" w:lastRow="0" w:noHBand="0" w:noVBand="1" w:val="04A0"/>
       </w:tblPr>
       <w:tblGrid>
-        <w:gridCol w:w="9972"/>
+        <w:gridCol w:w="3360"/>
+        <w:gridCol w:w="3360"/>
+        <w:gridCol w:w="3360"/>
       </w:tblGrid>
       <w:tr>
         <w:tc>
           <w:tcPr>
-            <w:tcW w:type="dxa" w:w="9972"/>
-            <w:shd w:fill="FFF4E5"/>
-            <w:tcBorders>
-              <w:top w:val="single" w:sz="4" w:space="0" w:color="B7CEDD"/>
-              <w:left w:val="single" w:sz="4" w:space="0" w:color="B7CEDD"/>
-              <w:bottom w:val="single" w:sz="4" w:space="0" w:color="B7CEDD"/>
-              <w:right w:val="single" w:sz="4" w:space="0" w:color="B7CEDD"/>
-            </w:tcBorders>
+            <w:tcW w:type="dxa" w:w="1800"/>
+            <w:vAlign w:val="center"/>
+            <w:shd w:fill="1F4E79"/>
+          </w:tcPr>
+          <w:p>
+            <w:pPr>
+              <w:spacing w:after="0"/>
+            </w:pPr>
+            <w:r/>
+            <w:r>
+              <w:rPr>
+                <w:b/>
+                <w:color w:val="FFFFFF"/>
+              </w:rPr>
+              <w:t>Step</w:t>
+            </w:r>
+          </w:p>
+        </w:tc>
+        <w:tc>
+          <w:tcPr>
+            <w:tcW w:type="dxa" w:w="4464"/>
+            <w:vAlign w:val="center"/>
+            <w:shd w:fill="1F4E79"/>
+          </w:tcPr>
+          <w:p>
+            <w:pPr>
+              <w:spacing w:after="0"/>
+            </w:pPr>
+            <w:r/>
+            <w:r>
+              <w:rPr>
+                <w:b/>
+                <w:color w:val="FFFFFF"/>
+              </w:rPr>
+              <w:t>Description</w:t>
+            </w:r>
+          </w:p>
+        </w:tc>
+        <w:tc>
+          <w:tcPr>
+            <w:tcW w:type="dxa" w:w="4608"/>
+            <w:vAlign w:val="center"/>
+            <w:shd w:fill="1F4E79"/>
+          </w:tcPr>
+          <w:p>
+            <w:pPr>
+              <w:spacing w:after="0"/>
+            </w:pPr>
+            <w:r/>
+            <w:r>
+              <w:rPr>
+                <w:b/>
+                <w:color w:val="FFFFFF"/>
+              </w:rPr>
+              <w:t>Leakage / realism control</w:t>
+            </w:r>
+          </w:p>
+        </w:tc>
+      </w:tr>
+      <w:tr>
+        <w:tc>
+          <w:tcPr>
+            <w:tcW w:type="dxa" w:w="1800"/>
             <w:vAlign w:val="center"/>
           </w:tcPr>
           <w:p>
             <w:pPr>
-              <w:spacing w:after="60"/>
+              <w:spacing w:after="0"/>
             </w:pPr>
+            <w:r/>
             <w:r>
               <w:rPr>
-                <w:rFonts w:ascii="Aptos Display" w:hAnsi="Aptos Display"/>
-                <w:b/>
-                <w:color w:val="9A5A00"/>
-                <w:sz w:val="22"/>
+                <w:b w:val="0"/>
               </w:rPr>
-              <w:t>Core pipeline clarification</w:t>
+              <w:t>1. Data loading</w:t>
             </w:r>
           </w:p>
+        </w:tc>
+        <w:tc>
+          <w:tcPr>
+            <w:tcW w:type="dxa" w:w="4464"/>
+            <w:vAlign w:val="center"/>
+          </w:tcPr>
           <w:p>
             <w:pPr>
               <w:spacing w:after="0"/>
             </w:pPr>
+            <w:r/>
             <w:r>
               <w:rPr>
-                <w:rFonts w:ascii="Aptos" w:hAnsi="Aptos"/>
-                <w:sz w:val="19"/>
+                <w:b w:val="0"/>
               </w:rPr>
-              <w:t>Feature engineering is performed on the full minute-resolution series before event sampling. The sampler is then fitted on training data only, and feature selection/scaling is also fitted on training data only before validation and test artifacts are transformed.</w:t>
+              <w:t>Download or cache minute OHLCV shards and select top-volume US equities.</w:t>
+            </w:r>
+          </w:p>
+        </w:tc>
+        <w:tc>
+          <w:tcPr>
+            <w:tcW w:type="dxa" w:w="4608"/>
+            <w:vAlign w:val="center"/>
+          </w:tcPr>
+          <w:p>
+            <w:pPr>
+              <w:spacing w:after="0"/>
+            </w:pPr>
+            <w:r/>
+            <w:r>
+              <w:rPr>
+                <w:b w:val="0"/>
+              </w:rPr>
+              <w:t>Chronological walk-forward folds, not random splits.</w:t>
+            </w:r>
+          </w:p>
+        </w:tc>
+      </w:tr>
+      <w:tr>
+        <w:tc>
+          <w:tcPr>
+            <w:tcW w:type="dxa" w:w="1800"/>
+            <w:vAlign w:val="center"/>
+          </w:tcPr>
+          <w:p>
+            <w:pPr>
+              <w:spacing w:after="0"/>
+            </w:pPr>
+            <w:r/>
+            <w:r>
+              <w:rPr>
+                <w:b w:val="0"/>
+              </w:rPr>
+              <w:t>2. Feature engineering</w:t>
+            </w:r>
+          </w:p>
+        </w:tc>
+        <w:tc>
+          <w:tcPr>
+            <w:tcW w:type="dxa" w:w="4464"/>
+            <w:vAlign w:val="center"/>
+          </w:tcPr>
+          <w:p>
+            <w:pPr>
+              <w:spacing w:after="0"/>
+            </w:pPr>
+            <w:r/>
+            <w:r>
+              <w:rPr>
+                <w:b w:val="0"/>
+              </w:rPr>
+              <w:t>Compute intraday technical indicators on minute bars before event sampling.</w:t>
+            </w:r>
+          </w:p>
+        </w:tc>
+        <w:tc>
+          <w:tcPr>
+            <w:tcW w:type="dxa" w:w="4608"/>
+            <w:vAlign w:val="center"/>
+          </w:tcPr>
+          <w:p>
+            <w:pPr>
+              <w:spacing w:after="0"/>
+            </w:pPr>
+            <w:r/>
+            <w:r>
+              <w:rPr>
+                <w:b w:val="0"/>
+              </w:rPr>
+              <w:t>Feature values are sampled at event timestamps after indicators are built on the regular minute grid.</w:t>
+            </w:r>
+          </w:p>
+        </w:tc>
+      </w:tr>
+      <w:tr>
+        <w:tc>
+          <w:tcPr>
+            <w:tcW w:type="dxa" w:w="1800"/>
+            <w:vAlign w:val="center"/>
+          </w:tcPr>
+          <w:p>
+            <w:pPr>
+              <w:spacing w:after="0"/>
+            </w:pPr>
+            <w:r/>
+            <w:r>
+              <w:rPr>
+                <w:b w:val="0"/>
+              </w:rPr>
+              <w:t>3. Train-only fitting</w:t>
+            </w:r>
+          </w:p>
+        </w:tc>
+        <w:tc>
+          <w:tcPr>
+            <w:tcW w:type="dxa" w:w="4464"/>
+            <w:vAlign w:val="center"/>
+          </w:tcPr>
+          <w:p>
+            <w:pPr>
+              <w:spacing w:after="0"/>
+            </w:pPr>
+            <w:r/>
+            <w:r>
+              <w:rPr>
+                <w:b w:val="0"/>
+              </w:rPr>
+              <w:t>Fit sampler parameters, scalers, and supervised feature selector from train data.</w:t>
+            </w:r>
+          </w:p>
+        </w:tc>
+        <w:tc>
+          <w:tcPr>
+            <w:tcW w:type="dxa" w:w="4608"/>
+            <w:vAlign w:val="center"/>
+          </w:tcPr>
+          <w:p>
+            <w:pPr>
+              <w:spacing w:after="0"/>
+            </w:pPr>
+            <w:r/>
+            <w:r>
+              <w:rPr>
+                <w:b w:val="0"/>
+              </w:rPr>
+              <w:t>Validation/test distributions and labels are not used to fit preparation state.</w:t>
+            </w:r>
+          </w:p>
+        </w:tc>
+      </w:tr>
+      <w:tr>
+        <w:tc>
+          <w:tcPr>
+            <w:tcW w:type="dxa" w:w="1800"/>
+            <w:vAlign w:val="center"/>
+          </w:tcPr>
+          <w:p>
+            <w:pPr>
+              <w:spacing w:after="0"/>
+            </w:pPr>
+            <w:r/>
+            <w:r>
+              <w:rPr>
+                <w:b w:val="0"/>
+              </w:rPr>
+              <w:t>4. Event sampling</w:t>
+            </w:r>
+          </w:p>
+        </w:tc>
+        <w:tc>
+          <w:tcPr>
+            <w:tcW w:type="dxa" w:w="4464"/>
+            <w:vAlign w:val="center"/>
+          </w:tcPr>
+          <w:p>
+            <w:pPr>
+              <w:spacing w:after="0"/>
+            </w:pPr>
+            <w:r/>
+            <w:r>
+              <w:rPr>
+                <w:b w:val="0"/>
+              </w:rPr>
+              <w:t>Use tuned CUSUM by default, with fixed-threshold CUSUM available for ablations.</w:t>
+            </w:r>
+          </w:p>
+        </w:tc>
+        <w:tc>
+          <w:tcPr>
+            <w:tcW w:type="dxa" w:w="4608"/>
+            <w:vAlign w:val="center"/>
+          </w:tcPr>
+          <w:p>
+            <w:pPr>
+              <w:spacing w:after="0"/>
+            </w:pPr>
+            <w:r/>
+            <w:r>
+              <w:rPr>
+                <w:b w:val="0"/>
+              </w:rPr>
+              <w:t>Sampler state is fitted on train data, then applied consistently to each split.</w:t>
+            </w:r>
+          </w:p>
+        </w:tc>
+      </w:tr>
+      <w:tr>
+        <w:tc>
+          <w:tcPr>
+            <w:tcW w:type="dxa" w:w="1800"/>
+            <w:vAlign w:val="center"/>
+          </w:tcPr>
+          <w:p>
+            <w:pPr>
+              <w:spacing w:after="0"/>
+            </w:pPr>
+            <w:r/>
+            <w:r>
+              <w:rPr>
+                <w:b w:val="0"/>
+              </w:rPr>
+              <w:t>5. Labeling</w:t>
+            </w:r>
+          </w:p>
+        </w:tc>
+        <w:tc>
+          <w:tcPr>
+            <w:tcW w:type="dxa" w:w="4464"/>
+            <w:vAlign w:val="center"/>
+          </w:tcPr>
+          <w:p>
+            <w:pPr>
+              <w:spacing w:after="0"/>
+            </w:pPr>
+            <w:r/>
+            <w:r>
+              <w:rPr>
+                <w:b w:val="0"/>
+              </w:rPr>
+              <w:t>Apply triple-barrier labels and keep event_outcome semantics.</w:t>
+            </w:r>
+          </w:p>
+        </w:tc>
+        <w:tc>
+          <w:tcPr>
+            <w:tcW w:type="dxa" w:w="4608"/>
+            <w:vAlign w:val="center"/>
+          </w:tcPr>
+          <w:p>
+            <w:pPr>
+              <w:spacing w:after="0"/>
+            </w:pPr>
+            <w:r/>
+            <w:r>
+              <w:rPr>
+                <w:b w:val="0"/>
+              </w:rPr>
+              <w:t>The signal event enters on the next sampled bar; pre-entry high/low cannot trigger barriers.</w:t>
+            </w:r>
+          </w:p>
+        </w:tc>
+      </w:tr>
+      <w:tr>
+        <w:tc>
+          <w:tcPr>
+            <w:tcW w:type="dxa" w:w="1800"/>
+            <w:vAlign w:val="center"/>
+          </w:tcPr>
+          <w:p>
+            <w:pPr>
+              <w:spacing w:after="0"/>
+            </w:pPr>
+            <w:r/>
+            <w:r>
+              <w:rPr>
+                <w:b w:val="0"/>
+              </w:rPr>
+              <w:t>6. Split safety</w:t>
+            </w:r>
+          </w:p>
+        </w:tc>
+        <w:tc>
+          <w:tcPr>
+            <w:tcW w:type="dxa" w:w="4464"/>
+            <w:vAlign w:val="center"/>
+          </w:tcPr>
+          <w:p>
+            <w:pPr>
+              <w:spacing w:after="0"/>
+            </w:pPr>
+            <w:r/>
+            <w:r>
+              <w:rPr>
+                <w:b w:val="0"/>
+              </w:rPr>
+              <w:t>Build train/validation/test indices from label intervals.</w:t>
+            </w:r>
+          </w:p>
+        </w:tc>
+        <w:tc>
+          <w:tcPr>
+            <w:tcW w:type="dxa" w:w="4608"/>
+            <w:vAlign w:val="center"/>
+          </w:tcPr>
+          <w:p>
+            <w:pPr>
+              <w:spacing w:after="0"/>
+            </w:pPr>
+            <w:r/>
+            <w:r>
+              <w:rPr>
+                <w:b w:val="0"/>
+              </w:rPr>
+              <w:t>Events crossing boundaries are purged and near-boundary events are embargoed.</w:t>
+            </w:r>
+          </w:p>
+        </w:tc>
+      </w:tr>
+      <w:tr>
+        <w:tc>
+          <w:tcPr>
+            <w:tcW w:type="dxa" w:w="1800"/>
+            <w:vAlign w:val="center"/>
+          </w:tcPr>
+          <w:p>
+            <w:pPr>
+              <w:spacing w:after="0"/>
+            </w:pPr>
+            <w:r/>
+            <w:r>
+              <w:rPr>
+                <w:b w:val="0"/>
+              </w:rPr>
+              <w:t>7. Training</w:t>
+            </w:r>
+          </w:p>
+        </w:tc>
+        <w:tc>
+          <w:tcPr>
+            <w:tcW w:type="dxa" w:w="4464"/>
+            <w:vAlign w:val="center"/>
+          </w:tcPr>
+          <w:p>
+            <w:pPr>
+              <w:spacing w:after="0"/>
+            </w:pPr>
+            <w:r/>
+            <w:r>
+              <w:rPr>
+                <w:b w:val="0"/>
+              </w:rPr>
+              <w:t>Train a PyTorch side classifier, then fit/evaluate a meta-label decision policy.</w:t>
+            </w:r>
+          </w:p>
+        </w:tc>
+        <w:tc>
+          <w:tcPr>
+            <w:tcW w:type="dxa" w:w="4608"/>
+            <w:vAlign w:val="center"/>
+          </w:tcPr>
+          <w:p>
+            <w:pPr>
+              <w:spacing w:after="0"/>
+            </w:pPr>
+            <w:r/>
+            <w:r>
+              <w:rPr>
+                <w:b w:val="0"/>
+              </w:rPr>
+              <w:t>Prepared artifact validation runs before training.</w:t>
+            </w:r>
+          </w:p>
+        </w:tc>
+      </w:tr>
+      <w:tr>
+        <w:tc>
+          <w:tcPr>
+            <w:tcW w:type="dxa" w:w="1800"/>
+            <w:vAlign w:val="center"/>
+          </w:tcPr>
+          <w:p>
+            <w:pPr>
+              <w:spacing w:after="0"/>
+            </w:pPr>
+            <w:r/>
+            <w:r>
+              <w:rPr>
+                <w:b w:val="0"/>
+              </w:rPr>
+              <w:t>8. Evaluation</w:t>
+            </w:r>
+          </w:p>
+        </w:tc>
+        <w:tc>
+          <w:tcPr>
+            <w:tcW w:type="dxa" w:w="4464"/>
+            <w:vAlign w:val="center"/>
+          </w:tcPr>
+          <w:p>
+            <w:pPr>
+              <w:spacing w:after="0"/>
+            </w:pPr>
+            <w:r/>
+            <w:r>
+              <w:rPr>
+                <w:b w:val="0"/>
+              </w:rPr>
+              <w:t>Log classification, meta, decision, execution, paper, and portfolio metrics.</w:t>
+            </w:r>
+          </w:p>
+        </w:tc>
+        <w:tc>
+          <w:tcPr>
+            <w:tcW w:type="dxa" w:w="4608"/>
+            <w:vAlign w:val="center"/>
+          </w:tcPr>
+          <w:p>
+            <w:pPr>
+              <w:spacing w:after="0"/>
+            </w:pPr>
+            <w:r/>
+            <w:r>
+              <w:rPr>
+                <w:b w:val="0"/>
+              </w:rPr>
+              <w:t>Portfolio simulator uses one account budget and explicit exposure constraints.</w:t>
+            </w:r>
+          </w:p>
+        </w:tc>
+      </w:tr>
+    </w:tbl>
+    <w:p/>
+    <w:p>
+      <w:pPr>
+        <w:pStyle w:val="Heading1"/>
+      </w:pPr>
+      <w:r>
+        <w:rPr>
+          <w:rFonts w:ascii="Aptos" w:hAnsi="Aptos" w:eastAsia="Aptos"/>
+        </w:rPr>
+        <w:t>4. Feature Engineering Before Sampling</w:t>
+      </w:r>
+    </w:p>
+    <w:p>
+      <w:r>
+        <w:rPr>
+          <w:rFonts w:ascii="Aptos" w:hAnsi="Aptos" w:eastAsia="Aptos"/>
+        </w:rPr>
+        <w:t>The project intentionally computes technical features on the original minute-resolution time series before event sampling. The sampler then chooses event timestamps, and the already-computed feature matrix is sampled at those timestamps. This differs from workflows that aggregate first and compute indicators on irregular event bars.</w:t>
+      </w:r>
+    </w:p>
+    <w:p>
+      <w:r>
+        <w:rPr>
+          <w:rFonts w:ascii="Aptos" w:hAnsi="Aptos" w:eastAsia="Aptos"/>
+        </w:rPr>
+        <w:t>This choice preserves indicator behavior on a stable minute grid and avoids changing moving-window meaning when event spacing varies. The learned feature pipeline remains train-only: standardization uses train statistics, and the supervised F-score selector is fitted only on train actionable side labels.</w:t>
+      </w:r>
+    </w:p>
+    <w:p>
+      <w:pPr>
+        <w:pStyle w:val="Heading1"/>
+      </w:pPr>
+      <w:r>
+        <w:rPr>
+          <w:rFonts w:ascii="Aptos" w:hAnsi="Aptos" w:eastAsia="Aptos"/>
+        </w:rPr>
+        <w:t>5. Labels, Timing, and Split Safety</w:t>
+      </w:r>
+    </w:p>
+    <w:p>
+      <w:pPr>
+        <w:pStyle w:val="ListBullet"/>
+      </w:pPr>
+      <w:r>
+        <w:rPr>
+          <w:rFonts w:ascii="Aptos" w:hAnsi="Aptos" w:eastAsia="Aptos"/>
+        </w:rPr>
+        <w:t>Prepared artifacts store the canonical event_outcome label space: down, exit, up.</w:t>
+      </w:r>
+    </w:p>
+    <w:p>
+      <w:pPr>
+        <w:pStyle w:val="ListBullet"/>
+      </w:pPr>
+      <w:r>
+        <w:rPr>
+          <w:rFonts w:ascii="Aptos" w:hAnsi="Aptos" w:eastAsia="Aptos"/>
+        </w:rPr>
+        <w:t>The sampled bar timestamp is treated as the model signal time.</w:t>
+      </w:r>
+    </w:p>
+    <w:p>
+      <w:pPr>
+        <w:pStyle w:val="ListBullet"/>
+      </w:pPr>
+      <w:r>
+        <w:rPr>
+          <w:rFonts w:ascii="Aptos" w:hAnsi="Aptos" w:eastAsia="Aptos"/>
+        </w:rPr>
+        <w:t>Trade execution uses the next sampled bar open, not the historical open of the signal bar.</w:t>
+      </w:r>
+    </w:p>
+    <w:p>
+      <w:pPr>
+        <w:pStyle w:val="ListBullet"/>
+      </w:pPr>
+      <w:r>
+        <w:rPr>
+          <w:rFonts w:ascii="Aptos" w:hAnsi="Aptos" w:eastAsia="Aptos"/>
+        </w:rPr>
+        <w:t>Barrier evaluation begins after the executable entry point, so pre-entry high/low data cannot affect outcomes.</w:t>
+      </w:r>
+    </w:p>
+    <w:p>
+      <w:pPr>
+        <w:pStyle w:val="ListBullet"/>
+      </w:pPr>
+      <w:r>
+        <w:rPr>
+          <w:rFonts w:ascii="Aptos" w:hAnsi="Aptos" w:eastAsia="Aptos"/>
+        </w:rPr>
+        <w:t>Train/validation/test membership is based on safe label intervals, with purge and embargo around split boundaries.</w:t>
+      </w:r>
+    </w:p>
+    <w:p>
+      <w:pPr>
+        <w:pStyle w:val="Heading1"/>
+      </w:pPr>
+      <w:r>
+        <w:rPr>
+          <w:rFonts w:ascii="Aptos" w:hAnsi="Aptos" w:eastAsia="Aptos"/>
+        </w:rPr>
+        <w:t>6. Models and Meta-Label Decision Layer</w:t>
+      </w:r>
+    </w:p>
+    <w:p>
+      <w:r>
+        <w:rPr>
+          <w:rFonts w:ascii="Aptos" w:hAnsi="Aptos" w:eastAsia="Aptos"/>
+        </w:rPr>
+        <w:t>The primary model is a binary side classifier trained on actionable down/up outcomes. The default fast baseline is Conv1D, and ResNet-LSTM is available as a stronger architecture for controlled experiments. The primary checkpoint metric is validation meta F1, because the final strategy must decide when to trade, not only which side to predict.</w:t>
+      </w:r>
+    </w:p>
+    <w:p>
+      <w:r>
+        <w:rPr>
+          <w:rFonts w:ascii="Aptos" w:hAnsi="Aptos" w:eastAsia="Aptos"/>
+        </w:rPr>
+        <w:t>The meta-label model decides whether a proposed side prediction should be taken. Its current input space includes model probability, learned embedding features, prepared volatility and recent-return aliases, rolling ticker win-rate and net-return statistics, prediction margin, prediction entropy, and time since the last event. These inputs are meant to help the strategy abstain when confidence, recent ticker behavior, or market context is weak.</w:t>
+      </w:r>
+    </w:p>
+    <w:p>
+      <w:pPr>
+        <w:pStyle w:val="Heading1"/>
+      </w:pPr>
+      <w:r>
+        <w:rPr>
+          <w:rFonts w:ascii="Aptos" w:hAnsi="Aptos" w:eastAsia="Aptos"/>
+        </w:rPr>
+        <w:t>7. Evaluation and W&amp;B Logging</w:t>
+      </w:r>
+    </w:p>
+    <w:tbl>
+      <w:tblPr>
+        <w:tblStyle w:val="TableGrid"/>
+        <w:tblW w:type="auto" w:w="0"/>
+        <w:jc w:val="center"/>
+        <w:tblLook w:firstColumn="1" w:firstRow="1" w:lastColumn="0" w:lastRow="0" w:noHBand="0" w:noVBand="1" w:val="04A0"/>
+      </w:tblPr>
+      <w:tblGrid>
+        <w:gridCol w:w="3360"/>
+        <w:gridCol w:w="3360"/>
+        <w:gridCol w:w="3360"/>
+      </w:tblGrid>
+      <w:tr>
+        <w:tc>
+          <w:tcPr>
+            <w:tcW w:type="dxa" w:w="1944"/>
+            <w:vAlign w:val="center"/>
+            <w:shd w:fill="1F4E79"/>
+          </w:tcPr>
+          <w:p>
+            <w:pPr>
+              <w:spacing w:after="0"/>
+            </w:pPr>
+            <w:r/>
+            <w:r>
+              <w:rPr>
+                <w:b/>
+                <w:color w:val="FFFFFF"/>
+              </w:rPr>
+              <w:t>Namespace</w:t>
+            </w:r>
+          </w:p>
+        </w:tc>
+        <w:tc>
+          <w:tcPr>
+            <w:tcW w:type="dxa" w:w="6120"/>
+            <w:vAlign w:val="center"/>
+            <w:shd w:fill="1F4E79"/>
+          </w:tcPr>
+          <w:p>
+            <w:pPr>
+              <w:spacing w:after="0"/>
+            </w:pPr>
+            <w:r/>
+            <w:r>
+              <w:rPr>
+                <w:b/>
+                <w:color w:val="FFFFFF"/>
+              </w:rPr>
+              <w:t>Meaning</w:t>
+            </w:r>
+          </w:p>
+        </w:tc>
+        <w:tc>
+          <w:tcPr>
+            <w:tcW w:type="dxa" w:w="2592"/>
+            <w:vAlign w:val="center"/>
+            <w:shd w:fill="1F4E79"/>
+          </w:tcPr>
+          <w:p>
+            <w:pPr>
+              <w:spacing w:after="0"/>
+            </w:pPr>
+            <w:r/>
+            <w:r>
+              <w:rPr>
+                <w:b/>
+                <w:color w:val="FFFFFF"/>
+              </w:rPr>
+              <w:t>Use in conclusions</w:t>
+            </w:r>
+          </w:p>
+        </w:tc>
+      </w:tr>
+      <w:tr>
+        <w:tc>
+          <w:tcPr>
+            <w:tcW w:type="dxa" w:w="1944"/>
+            <w:vAlign w:val="center"/>
+          </w:tcPr>
+          <w:p>
+            <w:pPr>
+              <w:spacing w:after="0"/>
+            </w:pPr>
+            <w:r/>
+            <w:r>
+              <w:rPr>
+                <w:b w:val="0"/>
+              </w:rPr>
+              <w:t>cls/*</w:t>
+            </w:r>
+          </w:p>
+        </w:tc>
+        <w:tc>
+          <w:tcPr>
+            <w:tcW w:type="dxa" w:w="6120"/>
+            <w:vAlign w:val="center"/>
+          </w:tcPr>
+          <w:p>
+            <w:pPr>
+              <w:spacing w:after="0"/>
+            </w:pPr>
+            <w:r/>
+            <w:r>
+              <w:rPr>
+                <w:b w:val="0"/>
+              </w:rPr>
+              <w:t>Primary side-model accuracy, F1, class balance, and confusion behavior before meta filtering.</w:t>
+            </w:r>
+          </w:p>
+        </w:tc>
+        <w:tc>
+          <w:tcPr>
+            <w:tcW w:type="dxa" w:w="2592"/>
+            <w:vAlign w:val="center"/>
+          </w:tcPr>
+          <w:p>
+            <w:pPr>
+              <w:spacing w:after="0"/>
+            </w:pPr>
+            <w:r/>
+            <w:r>
+              <w:rPr>
+                <w:b w:val="0"/>
+              </w:rPr>
+              <w:t>Diagnose learning quality.</w:t>
+            </w:r>
+          </w:p>
+        </w:tc>
+      </w:tr>
+      <w:tr>
+        <w:tc>
+          <w:tcPr>
+            <w:tcW w:type="dxa" w:w="1944"/>
+            <w:vAlign w:val="center"/>
+          </w:tcPr>
+          <w:p>
+            <w:pPr>
+              <w:spacing w:after="0"/>
+            </w:pPr>
+            <w:r/>
+            <w:r>
+              <w:rPr>
+                <w:b w:val="0"/>
+              </w:rPr>
+              <w:t>meta/*</w:t>
+            </w:r>
+          </w:p>
+        </w:tc>
+        <w:tc>
+          <w:tcPr>
+            <w:tcW w:type="dxa" w:w="6120"/>
+            <w:vAlign w:val="center"/>
+          </w:tcPr>
+          <w:p>
+            <w:pPr>
+              <w:spacing w:after="0"/>
+            </w:pPr>
+            <w:r/>
+            <w:r>
+              <w:rPr>
+                <w:b w:val="0"/>
+              </w:rPr>
+              <w:t>TAKE/PASS model quality, accept threshold, take probability, and take rate.</w:t>
+            </w:r>
+          </w:p>
+        </w:tc>
+        <w:tc>
+          <w:tcPr>
+            <w:tcW w:type="dxa" w:w="2592"/>
+            <w:vAlign w:val="center"/>
+          </w:tcPr>
+          <w:p>
+            <w:pPr>
+              <w:spacing w:after="0"/>
+            </w:pPr>
+            <w:r/>
+            <w:r>
+              <w:rPr>
+                <w:b w:val="0"/>
+              </w:rPr>
+              <w:t>Diagnose trade filtering.</w:t>
+            </w:r>
+          </w:p>
+        </w:tc>
+      </w:tr>
+      <w:tr>
+        <w:tc>
+          <w:tcPr>
+            <w:tcW w:type="dxa" w:w="1944"/>
+            <w:vAlign w:val="center"/>
+          </w:tcPr>
+          <w:p>
+            <w:pPr>
+              <w:spacing w:after="0"/>
+            </w:pPr>
+            <w:r/>
+            <w:r>
+              <w:rPr>
+                <w:b w:val="0"/>
+              </w:rPr>
+              <w:t>decision/*</w:t>
+            </w:r>
+          </w:p>
+        </w:tc>
+        <w:tc>
+          <w:tcPr>
+            <w:tcW w:type="dxa" w:w="6120"/>
+            <w:vAlign w:val="center"/>
+          </w:tcPr>
+          <w:p>
+            <w:pPr>
+              <w:spacing w:after="0"/>
+            </w:pPr>
+            <w:r/>
+            <w:r>
+              <w:rPr>
+                <w:b w:val="0"/>
+              </w:rPr>
+              <w:t>Final acted/abstained behavior and errors on actionable or exit truths.</w:t>
+            </w:r>
+          </w:p>
+        </w:tc>
+        <w:tc>
+          <w:tcPr>
+            <w:tcW w:type="dxa" w:w="2592"/>
+            <w:vAlign w:val="center"/>
+          </w:tcPr>
+          <w:p>
+            <w:pPr>
+              <w:spacing w:after="0"/>
+            </w:pPr>
+            <w:r/>
+            <w:r>
+              <w:rPr>
+                <w:b w:val="0"/>
+              </w:rPr>
+              <w:t>Diagnose final trade decisions.</w:t>
+            </w:r>
+          </w:p>
+        </w:tc>
+      </w:tr>
+      <w:tr>
+        <w:tc>
+          <w:tcPr>
+            <w:tcW w:type="dxa" w:w="1944"/>
+            <w:vAlign w:val="center"/>
+          </w:tcPr>
+          <w:p>
+            <w:pPr>
+              <w:spacing w:after="0"/>
+            </w:pPr>
+            <w:r/>
+            <w:r>
+              <w:rPr>
+                <w:b w:val="0"/>
+              </w:rPr>
+              <w:t>execution/*</w:t>
+            </w:r>
+          </w:p>
+        </w:tc>
+        <w:tc>
+          <w:tcPr>
+            <w:tcW w:type="dxa" w:w="6120"/>
+            <w:vAlign w:val="center"/>
+          </w:tcPr>
+          <w:p>
+            <w:pPr>
+              <w:spacing w:after="0"/>
+            </w:pPr>
+            <w:r/>
+            <w:r>
+              <w:rPr>
+                <w:b w:val="0"/>
+              </w:rPr>
+              <w:t>Raw signals, overlap suppression, executed trades, hit rate, and active time.</w:t>
+            </w:r>
+          </w:p>
+        </w:tc>
+        <w:tc>
+          <w:tcPr>
+            <w:tcW w:type="dxa" w:w="2592"/>
+            <w:vAlign w:val="center"/>
+          </w:tcPr>
+          <w:p>
+            <w:pPr>
+              <w:spacing w:after="0"/>
+            </w:pPr>
+            <w:r/>
+            <w:r>
+              <w:rPr>
+                <w:b w:val="0"/>
+              </w:rPr>
+              <w:t>Diagnose whether trades are realistically executable.</w:t>
+            </w:r>
+          </w:p>
+        </w:tc>
+      </w:tr>
+      <w:tr>
+        <w:tc>
+          <w:tcPr>
+            <w:tcW w:type="dxa" w:w="1944"/>
+            <w:vAlign w:val="center"/>
+          </w:tcPr>
+          <w:p>
+            <w:pPr>
+              <w:spacing w:after="0"/>
+            </w:pPr>
+            <w:r/>
+            <w:r>
+              <w:rPr>
+                <w:b w:val="0"/>
+              </w:rPr>
+              <w:t>paper/*</w:t>
+            </w:r>
+          </w:p>
+        </w:tc>
+        <w:tc>
+          <w:tcPr>
+            <w:tcW w:type="dxa" w:w="6120"/>
+            <w:vAlign w:val="center"/>
+          </w:tcPr>
+          <w:p>
+            <w:pPr>
+              <w:spacing w:after="0"/>
+            </w:pPr>
+            <w:r/>
+            <w:r>
+              <w:rPr>
+                <w:b w:val="0"/>
+              </w:rPr>
+              <w:t>Reference-style trade economics using non-overlapping trade diagnostics.</w:t>
+            </w:r>
+          </w:p>
+        </w:tc>
+        <w:tc>
+          <w:tcPr>
+            <w:tcW w:type="dxa" w:w="2592"/>
+            <w:vAlign w:val="center"/>
+          </w:tcPr>
+          <w:p>
+            <w:pPr>
+              <w:spacing w:after="0"/>
+            </w:pPr>
+            <w:r/>
+            <w:r>
+              <w:rPr>
+                <w:b w:val="0"/>
+              </w:rPr>
+              <w:t>Use as diagnostic comparison, not final account value.</w:t>
+            </w:r>
+          </w:p>
+        </w:tc>
+      </w:tr>
+      <w:tr>
+        <w:tc>
+          <w:tcPr>
+            <w:tcW w:type="dxa" w:w="1944"/>
+            <w:vAlign w:val="center"/>
+          </w:tcPr>
+          <w:p>
+            <w:pPr>
+              <w:spacing w:after="0"/>
+            </w:pPr>
+            <w:r/>
+            <w:r>
+              <w:rPr>
+                <w:b w:val="0"/>
+              </w:rPr>
+              <w:t>portfolio/*</w:t>
+            </w:r>
+          </w:p>
+        </w:tc>
+        <w:tc>
+          <w:tcPr>
+            <w:tcW w:type="dxa" w:w="6120"/>
+            <w:vAlign w:val="center"/>
+          </w:tcPr>
+          <w:p>
+            <w:pPr>
+              <w:spacing w:after="0"/>
+            </w:pPr>
+            <w:r/>
+            <w:r>
+              <w:rPr>
+                <w:b w:val="0"/>
+              </w:rPr>
+              <w:t>One-account simulation with cash, exposure, costs, drawdown, Sharpe, and skipped-budget trades.</w:t>
+            </w:r>
+          </w:p>
+        </w:tc>
+        <w:tc>
+          <w:tcPr>
+            <w:tcW w:type="dxa" w:w="2592"/>
+            <w:vAlign w:val="center"/>
+          </w:tcPr>
+          <w:p>
+            <w:pPr>
+              <w:spacing w:after="0"/>
+            </w:pPr>
+            <w:r/>
+            <w:r>
+              <w:rPr>
+                <w:b w:val="0"/>
+              </w:rPr>
+              <w:t>Use for final economic claims.</w:t>
             </w:r>
           </w:p>
         </w:tc>
@@ -222,7 +1501,10 @@
     <w:p/>
     <w:p>
       <w:r>
-        <w:br w:type="page"/>
+        <w:rPr>
+          <w:rFonts w:ascii="Aptos" w:hAnsi="Aptos" w:eastAsia="Aptos"/>
+        </w:rPr>
+        <w:t>Portfolio equity curves are logged to W&amp;B as perf/portfolio_equity_curve/{split}, with a companion chart at charts/portfolio_equity/{split}. The table contains step, timestamp, equity, cash, exposure percentage, and open-position count.</w:t>
       </w:r>
     </w:p>
     <w:p>
@@ -231,26 +1513,393 @@
       </w:pPr>
       <w:r>
         <w:rPr>
-          <w:rFonts w:ascii="Aptos Display" w:hAnsi="Aptos Display"/>
-          <w:color w:val="1F4E79"/>
+          <w:rFonts w:ascii="Aptos" w:hAnsi="Aptos" w:eastAsia="Aptos"/>
         </w:rPr>
-        <w:t>1. Project Overview</w:t>
+        <w:t>8. Portfolio Simulator Assumptions</w:t>
+      </w:r>
+    </w:p>
+    <w:tbl>
+      <w:tblPr>
+        <w:tblStyle w:val="TableGrid"/>
+        <w:tblW w:type="auto" w:w="0"/>
+        <w:jc w:val="center"/>
+        <w:tblLook w:firstColumn="1" w:firstRow="1" w:lastColumn="0" w:lastRow="0" w:noHBand="0" w:noVBand="1" w:val="04A0"/>
+      </w:tblPr>
+      <w:tblGrid>
+        <w:gridCol w:w="5040"/>
+        <w:gridCol w:w="5040"/>
+      </w:tblGrid>
+      <w:tr>
+        <w:tc>
+          <w:tcPr>
+            <w:tcW w:type="dxa" w:w="3168"/>
+            <w:vAlign w:val="center"/>
+            <w:shd w:fill="1F4E79"/>
+          </w:tcPr>
+          <w:p>
+            <w:pPr>
+              <w:spacing w:after="0"/>
+            </w:pPr>
+            <w:r/>
+            <w:r>
+              <w:rPr>
+                <w:b/>
+                <w:color w:val="FFFFFF"/>
+              </w:rPr>
+              <w:t>Assumption</w:t>
+            </w:r>
+          </w:p>
+        </w:tc>
+        <w:tc>
+          <w:tcPr>
+            <w:tcW w:type="dxa" w:w="7200"/>
+            <w:vAlign w:val="center"/>
+            <w:shd w:fill="1F4E79"/>
+          </w:tcPr>
+          <w:p>
+            <w:pPr>
+              <w:spacing w:after="0"/>
+            </w:pPr>
+            <w:r/>
+            <w:r>
+              <w:rPr>
+                <w:b/>
+                <w:color w:val="FFFFFF"/>
+              </w:rPr>
+              <w:t>Current default</w:t>
+            </w:r>
+          </w:p>
+        </w:tc>
+      </w:tr>
+      <w:tr>
+        <w:tc>
+          <w:tcPr>
+            <w:tcW w:type="dxa" w:w="3168"/>
+            <w:vAlign w:val="center"/>
+          </w:tcPr>
+          <w:p>
+            <w:pPr>
+              <w:spacing w:after="0"/>
+            </w:pPr>
+            <w:r/>
+            <w:r>
+              <w:rPr>
+                <w:b w:val="0"/>
+              </w:rPr>
+              <w:t>Initial cash</w:t>
+            </w:r>
+          </w:p>
+        </w:tc>
+        <w:tc>
+          <w:tcPr>
+            <w:tcW w:type="dxa" w:w="7200"/>
+            <w:vAlign w:val="center"/>
+          </w:tcPr>
+          <w:p>
+            <w:pPr>
+              <w:spacing w:after="0"/>
+            </w:pPr>
+            <w:r/>
+            <w:r>
+              <w:rPr>
+                <w:b w:val="0"/>
+              </w:rPr>
+              <w:t>$10,000</w:t>
+            </w:r>
+          </w:p>
+        </w:tc>
+      </w:tr>
+      <w:tr>
+        <w:tc>
+          <w:tcPr>
+            <w:tcW w:type="dxa" w:w="3168"/>
+            <w:vAlign w:val="center"/>
+          </w:tcPr>
+          <w:p>
+            <w:pPr>
+              <w:spacing w:after="0"/>
+            </w:pPr>
+            <w:r/>
+            <w:r>
+              <w:rPr>
+                <w:b w:val="0"/>
+              </w:rPr>
+              <w:t>Maximum position size</w:t>
+            </w:r>
+          </w:p>
+        </w:tc>
+        <w:tc>
+          <w:tcPr>
+            <w:tcW w:type="dxa" w:w="7200"/>
+            <w:vAlign w:val="center"/>
+          </w:tcPr>
+          <w:p>
+            <w:pPr>
+              <w:spacing w:after="0"/>
+            </w:pPr>
+            <w:r/>
+            <w:r>
+              <w:rPr>
+                <w:b w:val="0"/>
+              </w:rPr>
+              <w:t>5% of current equity per trade, scaled by meta bet size.</w:t>
+            </w:r>
+          </w:p>
+        </w:tc>
+      </w:tr>
+      <w:tr>
+        <w:tc>
+          <w:tcPr>
+            <w:tcW w:type="dxa" w:w="3168"/>
+            <w:vAlign w:val="center"/>
+          </w:tcPr>
+          <w:p>
+            <w:pPr>
+              <w:spacing w:after="0"/>
+            </w:pPr>
+            <w:r/>
+            <w:r>
+              <w:rPr>
+                <w:b w:val="0"/>
+              </w:rPr>
+              <w:t>Maximum total exposure</w:t>
+            </w:r>
+          </w:p>
+        </w:tc>
+        <w:tc>
+          <w:tcPr>
+            <w:tcW w:type="dxa" w:w="7200"/>
+            <w:vAlign w:val="center"/>
+          </w:tcPr>
+          <w:p>
+            <w:pPr>
+              <w:spacing w:after="0"/>
+            </w:pPr>
+            <w:r/>
+            <w:r>
+              <w:rPr>
+                <w:b w:val="0"/>
+              </w:rPr>
+              <w:t>100% gross exposure.</w:t>
+            </w:r>
+          </w:p>
+        </w:tc>
+      </w:tr>
+      <w:tr>
+        <w:tc>
+          <w:tcPr>
+            <w:tcW w:type="dxa" w:w="3168"/>
+            <w:vAlign w:val="center"/>
+          </w:tcPr>
+          <w:p>
+            <w:pPr>
+              <w:spacing w:after="0"/>
+            </w:pPr>
+            <w:r/>
+            <w:r>
+              <w:rPr>
+                <w:b w:val="0"/>
+              </w:rPr>
+              <w:t>Maximum concurrent positions</w:t>
+            </w:r>
+          </w:p>
+        </w:tc>
+        <w:tc>
+          <w:tcPr>
+            <w:tcW w:type="dxa" w:w="7200"/>
+            <w:vAlign w:val="center"/>
+          </w:tcPr>
+          <w:p>
+            <w:pPr>
+              <w:spacing w:after="0"/>
+            </w:pPr>
+            <w:r/>
+            <w:r>
+              <w:rPr>
+                <w:b w:val="0"/>
+              </w:rPr>
+              <w:t>10 open positions.</w:t>
+            </w:r>
+          </w:p>
+        </w:tc>
+      </w:tr>
+      <w:tr>
+        <w:tc>
+          <w:tcPr>
+            <w:tcW w:type="dxa" w:w="3168"/>
+            <w:vAlign w:val="center"/>
+          </w:tcPr>
+          <w:p>
+            <w:pPr>
+              <w:spacing w:after="0"/>
+            </w:pPr>
+            <w:r/>
+            <w:r>
+              <w:rPr>
+                <w:b w:val="0"/>
+              </w:rPr>
+              <w:t>Costs</w:t>
+            </w:r>
+          </w:p>
+        </w:tc>
+        <w:tc>
+          <w:tcPr>
+            <w:tcW w:type="dxa" w:w="7200"/>
+            <w:vAlign w:val="center"/>
+          </w:tcPr>
+          <w:p>
+            <w:pPr>
+              <w:spacing w:after="0"/>
+            </w:pPr>
+            <w:r/>
+            <w:r>
+              <w:rPr>
+                <w:b w:val="0"/>
+              </w:rPr>
+              <w:t>Entry and exit transaction costs are charged.</w:t>
+            </w:r>
+          </w:p>
+        </w:tc>
+      </w:tr>
+      <w:tr>
+        <w:tc>
+          <w:tcPr>
+            <w:tcW w:type="dxa" w:w="3168"/>
+            <w:vAlign w:val="center"/>
+          </w:tcPr>
+          <w:p>
+            <w:pPr>
+              <w:spacing w:after="0"/>
+            </w:pPr>
+            <w:r/>
+            <w:r>
+              <w:rPr>
+                <w:b w:val="0"/>
+              </w:rPr>
+              <w:t>Overlaps</w:t>
+            </w:r>
+          </w:p>
+        </w:tc>
+        <w:tc>
+          <w:tcPr>
+            <w:tcW w:type="dxa" w:w="7200"/>
+            <w:vAlign w:val="center"/>
+          </w:tcPr>
+          <w:p>
+            <w:pPr>
+              <w:spacing w:after="0"/>
+            </w:pPr>
+            <w:r/>
+            <w:r>
+              <w:rPr>
+                <w:b w:val="0"/>
+              </w:rPr>
+              <w:t>Same-ticker overlaps are suppressed before portfolio budget checks.</w:t>
+            </w:r>
+          </w:p>
+        </w:tc>
+      </w:tr>
+      <w:tr>
+        <w:tc>
+          <w:tcPr>
+            <w:tcW w:type="dxa" w:w="3168"/>
+            <w:vAlign w:val="center"/>
+          </w:tcPr>
+          <w:p>
+            <w:pPr>
+              <w:spacing w:after="0"/>
+            </w:pPr>
+            <w:r/>
+            <w:r>
+              <w:rPr>
+                <w:b w:val="0"/>
+              </w:rPr>
+              <w:t>Skipped trades</w:t>
+            </w:r>
+          </w:p>
+        </w:tc>
+        <w:tc>
+          <w:tcPr>
+            <w:tcW w:type="dxa" w:w="7200"/>
+            <w:vAlign w:val="center"/>
+          </w:tcPr>
+          <w:p>
+            <w:pPr>
+              <w:spacing w:after="0"/>
+            </w:pPr>
+            <w:r/>
+            <w:r>
+              <w:rPr>
+                <w:b w:val="0"/>
+              </w:rPr>
+              <w:t>Trades can be skipped when cash, exposure, or max-position limits are exhausted.</w:t>
+            </w:r>
+          </w:p>
+        </w:tc>
+      </w:tr>
+    </w:tbl>
+    <w:p/>
+    <w:p>
+      <w:pPr>
+        <w:pStyle w:val="Heading1"/>
+      </w:pPr>
+      <w:r>
+        <w:rPr>
+          <w:rFonts w:ascii="Aptos" w:hAnsi="Aptos" w:eastAsia="Aptos"/>
+        </w:rPr>
+        <w:t>9. Reproducibility and Project Structure</w:t>
+      </w:r>
+    </w:p>
+    <w:p>
+      <w:r>
+        <w:rPr>
+          <w:rFonts w:ascii="Aptos" w:hAnsi="Aptos" w:eastAsia="Aptos"/>
+        </w:rPr>
+        <w:t>The repository is organized as a single project root. Source code, tests, documentation, reports, configuration, dependency metadata, and uv.lock are tracked. Generated runtime outputs are ignored and can be regenerated from commands and source code.</w:t>
       </w:r>
     </w:p>
     <w:p>
       <w:pPr>
-        <w:pStyle w:val="BodyText"/>
+        <w:pStyle w:val="ListBullet"/>
       </w:pPr>
       <w:r>
-        <w:t>`kvant` is a quant research project for short-horizon US equity trading on minute-level OHLCV data. The current approach follows a Lopez de Prado-inspired side-plus-meta-labeling workflow. Prepared artifacts keep the raw three-class triple-barrier event outcome (`down`, `exit`, `up`), the training pipeline derives a binary primary side target (`down`, `up`), and a meta-label layer decides whether a predicted side should be traded or abstained from.</w:t>
+        <w:rPr>
+          <w:rFonts w:ascii="Aptos" w:hAnsi="Aptos" w:eastAsia="Aptos"/>
+        </w:rPr>
+        <w:t>Use uv for Python execution and dependency management.</w:t>
       </w:r>
     </w:p>
     <w:p>
       <w:pPr>
-        <w:pStyle w:val="BodyText"/>
+        <w:pStyle w:val="ListBullet"/>
       </w:pPr>
       <w:r>
-        <w:t>The project is organized around reproducible walk-forward folds. Data preparation creates train, validation, and test artifacts with sampled OHLCV, engineered features, labels, metadata, and diagnostics. Training consumes those artifacts with PyTorch models, validates the artifact contract before running, logs metrics through W&amp;B, and evaluates both model quality and trading-oriented behavior under transaction costs.</w:t>
+        <w:rPr>
+          <w:rFonts w:ascii="Aptos" w:hAnsi="Aptos" w:eastAsia="Aptos"/>
+        </w:rPr>
+        <w:t>Use pytest for tests and ruff for linting/formatting.</w:t>
+      </w:r>
+    </w:p>
+    <w:p>
+      <w:pPr>
+        <w:pStyle w:val="ListBullet"/>
+      </w:pPr>
+      <w:r>
+        <w:rPr>
+          <w:rFonts w:ascii="Aptos" w:hAnsi="Aptos" w:eastAsia="Aptos"/>
+        </w:rPr>
+        <w:t>Use prepared manifests to make training runs reproducible.</w:t>
+      </w:r>
+    </w:p>
+    <w:p>
+      <w:pPr>
+        <w:pStyle w:val="ListBullet"/>
+      </w:pPr>
+      <w:r>
+        <w:rPr>
+          <w:rFonts w:ascii="Aptos" w:hAnsi="Aptos" w:eastAsia="Aptos"/>
+        </w:rPr>
+        <w:t>Update the implementation matrix, team change log, and AI dialog log when methodology changes.</w:t>
       </w:r>
     </w:p>
     <w:p>
@@ -259,162 +1908,58 @@
       </w:pPr>
       <w:r>
         <w:rPr>
-          <w:rFonts w:ascii="Aptos Display" w:hAnsi="Aptos Display"/>
-          <w:color w:val="1F4E79"/>
+          <w:rFonts w:ascii="Aptos" w:hAnsi="Aptos" w:eastAsia="Aptos"/>
         </w:rPr>
-        <w:t>2. Research Objective</w:t>
-      </w:r>
-    </w:p>
-    <w:p>
-      <w:pPr>
-        <w:pStyle w:val="BodyText"/>
-      </w:pPr>
-      <w:r>
-        <w:t>The goal is not simply to maximize classification accuracy. The central question is whether a model can identify trade directions and decide when to abstain in a way that improves acted-trade quality and economic outcomes after transaction costs.</w:t>
-      </w:r>
-    </w:p>
-    <w:p>
-      <w:pPr>
-        <w:pStyle w:val="ListBullet"/>
-        <w:spacing w:after="60"/>
-        <w:ind w:left="312"/>
-      </w:pPr>
-      <w:r>
-        <w:rPr>
-          <w:rFonts w:ascii="Aptos" w:hAnsi="Aptos"/>
-          <w:sz w:val="21"/>
-        </w:rPr>
-        <w:t>Train a primary side model that predicts whether actionable events move down or up.</w:t>
-      </w:r>
-    </w:p>
-    <w:p>
-      <w:pPr>
-        <w:pStyle w:val="ListBullet"/>
-        <w:spacing w:after="60"/>
-        <w:ind w:left="312"/>
-      </w:pPr>
-      <w:r>
-        <w:rPr>
-          <w:rFonts w:ascii="Aptos" w:hAnsi="Aptos"/>
-          <w:sz w:val="21"/>
-        </w:rPr>
-        <w:t>Use a meta-label decision layer to filter low-confidence or low-quality side predictions.</w:t>
-      </w:r>
-    </w:p>
-    <w:p>
-      <w:pPr>
-        <w:pStyle w:val="ListBullet"/>
-        <w:spacing w:after="60"/>
-        <w:ind w:left="312"/>
-      </w:pPr>
-      <w:r>
-        <w:rPr>
-          <w:rFonts w:ascii="Aptos" w:hAnsi="Aptos"/>
-          <w:sz w:val="21"/>
-        </w:rPr>
-        <w:t>Evaluate the complete decision pipeline: side quality, meta acceptance, acted trades, abstentions, and cost-aware profit metrics.</w:t>
-      </w:r>
-    </w:p>
-    <w:p>
-      <w:pPr>
-        <w:pStyle w:val="Heading1"/>
-      </w:pPr>
-      <w:r>
-        <w:rPr>
-          <w:rFonts w:ascii="Aptos Display" w:hAnsi="Aptos Display"/>
-          <w:color w:val="1F4E79"/>
-        </w:rPr>
-        <w:t>3. Current Pipeline</w:t>
+        <w:t>10. Quality Gates</w:t>
       </w:r>
     </w:p>
     <w:tbl>
       <w:tblPr>
+        <w:tblStyle w:val="TableGrid"/>
         <w:tblW w:type="auto" w:w="0"/>
         <w:jc w:val="center"/>
         <w:tblLook w:firstColumn="1" w:firstRow="1" w:lastColumn="0" w:lastRow="0" w:noHBand="0" w:noVBand="1" w:val="04A0"/>
       </w:tblPr>
       <w:tblGrid>
-        <w:gridCol w:w="3324"/>
-        <w:gridCol w:w="3324"/>
-        <w:gridCol w:w="3324"/>
+        <w:gridCol w:w="5040"/>
+        <w:gridCol w:w="5040"/>
       </w:tblGrid>
       <w:tr>
         <w:tc>
           <w:tcPr>
-            <w:tcW w:type="dxa" w:w="3324"/>
+            <w:tcW w:type="dxa" w:w="3744"/>
+            <w:vAlign w:val="center"/>
             <w:shd w:fill="1F4E79"/>
-            <w:tcBorders>
-              <w:top w:val="single" w:sz="4" w:space="0" w:color="1F4E79"/>
-              <w:left w:val="single" w:sz="4" w:space="0" w:color="1F4E79"/>
-              <w:bottom w:val="single" w:sz="4" w:space="0" w:color="1F4E79"/>
-              <w:right w:val="single" w:sz="4" w:space="0" w:color="1F4E79"/>
-            </w:tcBorders>
           </w:tcPr>
           <w:p>
             <w:pPr>
-              <w:jc w:val="left"/>
+              <w:spacing w:after="0"/>
             </w:pPr>
             <w:r/>
             <w:r>
               <w:rPr>
-                <w:rFonts w:ascii="Aptos" w:hAnsi="Aptos"/>
                 <w:b/>
                 <w:color w:val="FFFFFF"/>
-                <w:sz w:val="19"/>
               </w:rPr>
-              <w:t>Step</w:t>
+              <w:t>Gate</w:t>
             </w:r>
           </w:p>
         </w:tc>
         <w:tc>
           <w:tcPr>
-            <w:tcW w:type="dxa" w:w="3324"/>
+            <w:tcW w:type="dxa" w:w="6768"/>
+            <w:vAlign w:val="center"/>
             <w:shd w:fill="1F4E79"/>
-            <w:tcBorders>
-              <w:top w:val="single" w:sz="4" w:space="0" w:color="1F4E79"/>
-              <w:left w:val="single" w:sz="4" w:space="0" w:color="1F4E79"/>
-              <w:bottom w:val="single" w:sz="4" w:space="0" w:color="1F4E79"/>
-              <w:right w:val="single" w:sz="4" w:space="0" w:color="1F4E79"/>
-            </w:tcBorders>
           </w:tcPr>
           <w:p>
             <w:pPr>
-              <w:jc w:val="left"/>
+              <w:spacing w:after="0"/>
             </w:pPr>
             <w:r/>
             <w:r>
               <w:rPr>
-                <w:rFonts w:ascii="Aptos" w:hAnsi="Aptos"/>
                 <w:b/>
                 <w:color w:val="FFFFFF"/>
-                <w:sz w:val="19"/>
-              </w:rPr>
-              <w:t>Stage</w:t>
-            </w:r>
-          </w:p>
-        </w:tc>
-        <w:tc>
-          <w:tcPr>
-            <w:tcW w:type="dxa" w:w="3324"/>
-            <w:shd w:fill="1F4E79"/>
-            <w:tcBorders>
-              <w:top w:val="single" w:sz="4" w:space="0" w:color="1F4E79"/>
-              <w:left w:val="single" w:sz="4" w:space="0" w:color="1F4E79"/>
-              <w:bottom w:val="single" w:sz="4" w:space="0" w:color="1F4E79"/>
-              <w:right w:val="single" w:sz="4" w:space="0" w:color="1F4E79"/>
-            </w:tcBorders>
-          </w:tcPr>
-          <w:p>
-            <w:pPr>
-              <w:jc w:val="left"/>
-            </w:pPr>
-            <w:r/>
-            <w:r>
-              <w:rPr>
-                <w:rFonts w:ascii="Aptos" w:hAnsi="Aptos"/>
-                <w:b/>
-                <w:color w:val="FFFFFF"/>
-                <w:sz w:val="19"/>
               </w:rPr>
               <w:t>Purpose</w:t>
             </w:r>
@@ -424,79 +1969,37 @@
       <w:tr>
         <w:tc>
           <w:tcPr>
-            <w:tcW w:type="dxa" w:w="3324"/>
-            <w:shd w:fill="F8FAFC"/>
-            <w:tcBorders>
-              <w:top w:val="single" w:sz="4" w:space="0" w:color="D9E2EC"/>
-              <w:left w:val="single" w:sz="4" w:space="0" w:color="D9E2EC"/>
-              <w:bottom w:val="single" w:sz="4" w:space="0" w:color="D9E2EC"/>
-              <w:right w:val="single" w:sz="4" w:space="0" w:color="D9E2EC"/>
-            </w:tcBorders>
+            <w:tcW w:type="dxa" w:w="3744"/>
+            <w:vAlign w:val="center"/>
           </w:tcPr>
           <w:p>
             <w:pPr>
-              <w:jc w:val="left"/>
+              <w:spacing w:after="0"/>
             </w:pPr>
             <w:r/>
             <w:r>
               <w:rPr>
-                <w:rFonts w:ascii="Aptos" w:hAnsi="Aptos"/>
                 <w:b w:val="0"/>
-                <w:sz w:val="19"/>
               </w:rPr>
-              <w:t>1</w:t>
+              <w:t>uv run ruff check .</w:t>
             </w:r>
           </w:p>
         </w:tc>
         <w:tc>
           <w:tcPr>
-            <w:tcW w:type="dxa" w:w="3324"/>
-            <w:shd w:fill="F8FAFC"/>
-            <w:tcBorders>
-              <w:top w:val="single" w:sz="4" w:space="0" w:color="D9E2EC"/>
-              <w:left w:val="single" w:sz="4" w:space="0" w:color="D9E2EC"/>
-              <w:bottom w:val="single" w:sz="4" w:space="0" w:color="D9E2EC"/>
-              <w:right w:val="single" w:sz="4" w:space="0" w:color="D9E2EC"/>
-            </w:tcBorders>
+            <w:tcW w:type="dxa" w:w="6768"/>
+            <w:vAlign w:val="center"/>
           </w:tcPr>
           <w:p>
             <w:pPr>
-              <w:jc w:val="left"/>
+              <w:spacing w:after="0"/>
             </w:pPr>
             <w:r/>
             <w:r>
               <w:rPr>
-                <w:rFonts w:ascii="Aptos" w:hAnsi="Aptos"/>
-                <w:b/>
-                <w:sz w:val="19"/>
+                <w:b w:val="0"/>
               </w:rPr>
-              <w:t>Load minute OHLCV data</w:t>
-            </w:r>
-          </w:p>
-        </w:tc>
-        <w:tc>
-          <w:tcPr>
-            <w:tcW w:type="dxa" w:w="3324"/>
-            <w:shd w:fill="F8FAFC"/>
-            <w:tcBorders>
-              <w:top w:val="single" w:sz="4" w:space="0" w:color="D9E2EC"/>
-              <w:left w:val="single" w:sz="4" w:space="0" w:color="D9E2EC"/>
-              <w:bottom w:val="single" w:sz="4" w:space="0" w:color="D9E2EC"/>
-              <w:right w:val="single" w:sz="4" w:space="0" w:color="D9E2EC"/>
-            </w:tcBorders>
-          </w:tcPr>
-          <w:p>
-            <w:pPr>
-              <w:jc w:val="left"/>
-            </w:pPr>
-            <w:r/>
-            <w:r>
-              <w:rPr>
-                <w:rFonts w:ascii="Aptos" w:hAnsi="Aptos"/>
-                <w:b w:val="0"/>
-                <w:sz w:val="19"/>
-              </w:rPr>
-              <w:t>Ticker-level minute bars are loaded and aligned for walk-forward preparation.</w:t>
+              <w:t>Checks lint and code-quality rules.</w:t>
             </w:r>
           </w:p>
         </w:tc>
@@ -504,79 +2007,37 @@
       <w:tr>
         <w:tc>
           <w:tcPr>
-            <w:tcW w:type="dxa" w:w="3324"/>
-            <w:shd w:fill="FFFFFF"/>
-            <w:tcBorders>
-              <w:top w:val="single" w:sz="4" w:space="0" w:color="D9E2EC"/>
-              <w:left w:val="single" w:sz="4" w:space="0" w:color="D9E2EC"/>
-              <w:bottom w:val="single" w:sz="4" w:space="0" w:color="D9E2EC"/>
-              <w:right w:val="single" w:sz="4" w:space="0" w:color="D9E2EC"/>
-            </w:tcBorders>
+            <w:tcW w:type="dxa" w:w="3744"/>
+            <w:vAlign w:val="center"/>
           </w:tcPr>
           <w:p>
             <w:pPr>
-              <w:jc w:val="left"/>
+              <w:spacing w:after="0"/>
             </w:pPr>
             <w:r/>
             <w:r>
               <w:rPr>
-                <w:rFonts w:ascii="Aptos" w:hAnsi="Aptos"/>
                 <w:b w:val="0"/>
-                <w:sz w:val="19"/>
               </w:rPr>
-              <w:t>2</w:t>
+              <w:t>uv run pytest</w:t>
             </w:r>
           </w:p>
         </w:tc>
         <w:tc>
           <w:tcPr>
-            <w:tcW w:type="dxa" w:w="3324"/>
-            <w:shd w:fill="FFFFFF"/>
-            <w:tcBorders>
-              <w:top w:val="single" w:sz="4" w:space="0" w:color="D9E2EC"/>
-              <w:left w:val="single" w:sz="4" w:space="0" w:color="D9E2EC"/>
-              <w:bottom w:val="single" w:sz="4" w:space="0" w:color="D9E2EC"/>
-              <w:right w:val="single" w:sz="4" w:space="0" w:color="D9E2EC"/>
-            </w:tcBorders>
+            <w:tcW w:type="dxa" w:w="6768"/>
+            <w:vAlign w:val="center"/>
           </w:tcPr>
           <w:p>
             <w:pPr>
-              <w:jc w:val="left"/>
+              <w:spacing w:after="0"/>
             </w:pPr>
             <w:r/>
             <w:r>
               <w:rPr>
-                <w:rFonts w:ascii="Aptos" w:hAnsi="Aptos"/>
-                <w:b/>
-                <w:sz w:val="19"/>
+                <w:b w:val="0"/>
               </w:rPr>
-              <w:t>Feature engineering before sampling</w:t>
-            </w:r>
-          </w:p>
-        </w:tc>
-        <w:tc>
-          <w:tcPr>
-            <w:tcW w:type="dxa" w:w="3324"/>
-            <w:shd w:fill="FFFFFF"/>
-            <w:tcBorders>
-              <w:top w:val="single" w:sz="4" w:space="0" w:color="D9E2EC"/>
-              <w:left w:val="single" w:sz="4" w:space="0" w:color="D9E2EC"/>
-              <w:bottom w:val="single" w:sz="4" w:space="0" w:color="D9E2EC"/>
-              <w:right w:val="single" w:sz="4" w:space="0" w:color="D9E2EC"/>
-            </w:tcBorders>
-          </w:tcPr>
-          <w:p>
-            <w:pPr>
-              <w:jc w:val="left"/>
-            </w:pPr>
-            <w:r/>
-            <w:r>
-              <w:rPr>
-                <w:rFonts w:ascii="Aptos" w:hAnsi="Aptos"/>
-                <w:b w:val="0"/>
-                <w:sz w:val="19"/>
-              </w:rPr>
-              <w:t>Technical and paper-inspired features are computed on the full minute-resolution series before bars are sampled.</w:t>
+              <w:t>Runs unit and pipeline-contract tests.</w:t>
             </w:r>
           </w:p>
         </w:tc>
@@ -584,79 +2045,37 @@
       <w:tr>
         <w:tc>
           <w:tcPr>
-            <w:tcW w:type="dxa" w:w="3324"/>
-            <w:shd w:fill="F8FAFC"/>
-            <w:tcBorders>
-              <w:top w:val="single" w:sz="4" w:space="0" w:color="D9E2EC"/>
-              <w:left w:val="single" w:sz="4" w:space="0" w:color="D9E2EC"/>
-              <w:bottom w:val="single" w:sz="4" w:space="0" w:color="D9E2EC"/>
-              <w:right w:val="single" w:sz="4" w:space="0" w:color="D9E2EC"/>
-            </w:tcBorders>
+            <w:tcW w:type="dxa" w:w="3744"/>
+            <w:vAlign w:val="center"/>
           </w:tcPr>
           <w:p>
             <w:pPr>
-              <w:jc w:val="left"/>
+              <w:spacing w:after="0"/>
             </w:pPr>
             <w:r/>
             <w:r>
               <w:rPr>
-                <w:rFonts w:ascii="Aptos" w:hAnsi="Aptos"/>
                 <w:b w:val="0"/>
-                <w:sz w:val="19"/>
               </w:rPr>
-              <w:t>3</w:t>
+              <w:t>smoke_prepared_experiment</w:t>
             </w:r>
           </w:p>
         </w:tc>
         <w:tc>
           <w:tcPr>
-            <w:tcW w:type="dxa" w:w="3324"/>
-            <w:shd w:fill="F8FAFC"/>
-            <w:tcBorders>
-              <w:top w:val="single" w:sz="4" w:space="0" w:color="D9E2EC"/>
-              <w:left w:val="single" w:sz="4" w:space="0" w:color="D9E2EC"/>
-              <w:bottom w:val="single" w:sz="4" w:space="0" w:color="D9E2EC"/>
-              <w:right w:val="single" w:sz="4" w:space="0" w:color="D9E2EC"/>
-            </w:tcBorders>
+            <w:tcW w:type="dxa" w:w="6768"/>
+            <w:vAlign w:val="center"/>
           </w:tcPr>
           <w:p>
             <w:pPr>
-              <w:jc w:val="left"/>
+              <w:spacing w:after="0"/>
             </w:pPr>
             <w:r/>
             <w:r>
               <w:rPr>
-                <w:rFonts w:ascii="Aptos" w:hAnsi="Aptos"/>
-                <w:b/>
-                <w:sz w:val="19"/>
+                <w:b w:val="0"/>
               </w:rPr>
-              <w:t>Train-only sampler fit</w:t>
-            </w:r>
-          </w:p>
-        </w:tc>
-        <w:tc>
-          <w:tcPr>
-            <w:tcW w:type="dxa" w:w="3324"/>
-            <w:shd w:fill="F8FAFC"/>
-            <w:tcBorders>
-              <w:top w:val="single" w:sz="4" w:space="0" w:color="D9E2EC"/>
-              <w:left w:val="single" w:sz="4" w:space="0" w:color="D9E2EC"/>
-              <w:bottom w:val="single" w:sz="4" w:space="0" w:color="D9E2EC"/>
-              <w:right w:val="single" w:sz="4" w:space="0" w:color="D9E2EC"/>
-            </w:tcBorders>
-          </w:tcPr>
-          <w:p>
-            <w:pPr>
-              <w:jc w:val="left"/>
-            </w:pPr>
-            <w:r/>
-            <w:r>
-              <w:rPr>
-                <w:rFonts w:ascii="Aptos" w:hAnsi="Aptos"/>
-                <w:b w:val="0"/>
-                <w:sz w:val="19"/>
-              </w:rPr>
-              <w:t>The tuned CUSUM sampler is fitted only on training data to target a configurable bars-per-day density.</w:t>
+              <w:t>Validates generated prepared artifacts before a longer training run.</w:t>
             </w:r>
           </w:p>
         </w:tc>
@@ -664,79 +2083,37 @@
       <w:tr>
         <w:tc>
           <w:tcPr>
-            <w:tcW w:type="dxa" w:w="3324"/>
-            <w:shd w:fill="FFFFFF"/>
-            <w:tcBorders>
-              <w:top w:val="single" w:sz="4" w:space="0" w:color="D9E2EC"/>
-              <w:left w:val="single" w:sz="4" w:space="0" w:color="D9E2EC"/>
-              <w:bottom w:val="single" w:sz="4" w:space="0" w:color="D9E2EC"/>
-              <w:right w:val="single" w:sz="4" w:space="0" w:color="D9E2EC"/>
-            </w:tcBorders>
+            <w:tcW w:type="dxa" w:w="3744"/>
+            <w:vAlign w:val="center"/>
           </w:tcPr>
           <w:p>
             <w:pPr>
-              <w:jc w:val="left"/>
+              <w:spacing w:after="0"/>
             </w:pPr>
             <w:r/>
             <w:r>
               <w:rPr>
-                <w:rFonts w:ascii="Aptos" w:hAnsi="Aptos"/>
                 <w:b w:val="0"/>
-                <w:sz w:val="19"/>
               </w:rPr>
-              <w:t>4</w:t>
+              <w:t>Metric registry and W&amp;B setup tables</w:t>
             </w:r>
           </w:p>
         </w:tc>
         <w:tc>
           <w:tcPr>
-            <w:tcW w:type="dxa" w:w="3324"/>
-            <w:shd w:fill="FFFFFF"/>
-            <w:tcBorders>
-              <w:top w:val="single" w:sz="4" w:space="0" w:color="D9E2EC"/>
-              <w:left w:val="single" w:sz="4" w:space="0" w:color="D9E2EC"/>
-              <w:bottom w:val="single" w:sz="4" w:space="0" w:color="D9E2EC"/>
-              <w:right w:val="single" w:sz="4" w:space="0" w:color="D9E2EC"/>
-            </w:tcBorders>
+            <w:tcW w:type="dxa" w:w="6768"/>
+            <w:vAlign w:val="center"/>
           </w:tcPr>
           <w:p>
             <w:pPr>
-              <w:jc w:val="left"/>
+              <w:spacing w:after="0"/>
             </w:pPr>
             <w:r/>
             <w:r>
               <w:rPr>
-                <w:rFonts w:ascii="Aptos" w:hAnsi="Aptos"/>
-                <w:b/>
-                <w:sz w:val="19"/>
+                <w:b w:val="0"/>
               </w:rPr>
-              <w:t>Apply event sampling</w:t>
-            </w:r>
-          </w:p>
-        </w:tc>
-        <w:tc>
-          <w:tcPr>
-            <w:tcW w:type="dxa" w:w="3324"/>
-            <w:shd w:fill="FFFFFF"/>
-            <w:tcBorders>
-              <w:top w:val="single" w:sz="4" w:space="0" w:color="D9E2EC"/>
-              <w:left w:val="single" w:sz="4" w:space="0" w:color="D9E2EC"/>
-              <w:bottom w:val="single" w:sz="4" w:space="0" w:color="D9E2EC"/>
-              <w:right w:val="single" w:sz="4" w:space="0" w:color="D9E2EC"/>
-            </w:tcBorders>
-          </w:tcPr>
-          <w:p>
-            <w:pPr>
-              <w:jc w:val="left"/>
-            </w:pPr>
-            <w:r/>
-            <w:r>
-              <w:rPr>
-                <w:rFonts w:ascii="Aptos" w:hAnsi="Aptos"/>
-                <w:b w:val="0"/>
-                <w:sz w:val="19"/>
-              </w:rPr>
-              <w:t>The fitted sampler transforms train, validation, and test splits into event bars.</w:t>
+              <w:t>Make metric meanings visible in each run.</w:t>
             </w:r>
           </w:p>
         </w:tc>
@@ -744,478 +2121,107 @@
       <w:tr>
         <w:tc>
           <w:tcPr>
-            <w:tcW w:type="dxa" w:w="3324"/>
-            <w:shd w:fill="F8FAFC"/>
-            <w:tcBorders>
-              <w:top w:val="single" w:sz="4" w:space="0" w:color="D9E2EC"/>
-              <w:left w:val="single" w:sz="4" w:space="0" w:color="D9E2EC"/>
-              <w:bottom w:val="single" w:sz="4" w:space="0" w:color="D9E2EC"/>
-              <w:right w:val="single" w:sz="4" w:space="0" w:color="D9E2EC"/>
-            </w:tcBorders>
+            <w:tcW w:type="dxa" w:w="3744"/>
+            <w:vAlign w:val="center"/>
           </w:tcPr>
           <w:p>
             <w:pPr>
-              <w:jc w:val="left"/>
+              <w:spacing w:after="0"/>
             </w:pPr>
             <w:r/>
             <w:r>
               <w:rPr>
-                <w:rFonts w:ascii="Aptos" w:hAnsi="Aptos"/>
                 <w:b w:val="0"/>
-                <w:sz w:val="19"/>
               </w:rPr>
-              <w:t>5</w:t>
+              <w:t>Team logs</w:t>
             </w:r>
           </w:p>
         </w:tc>
         <w:tc>
           <w:tcPr>
-            <w:tcW w:type="dxa" w:w="3324"/>
-            <w:shd w:fill="F8FAFC"/>
-            <w:tcBorders>
-              <w:top w:val="single" w:sz="4" w:space="0" w:color="D9E2EC"/>
-              <w:left w:val="single" w:sz="4" w:space="0" w:color="D9E2EC"/>
-              <w:bottom w:val="single" w:sz="4" w:space="0" w:color="D9E2EC"/>
-              <w:right w:val="single" w:sz="4" w:space="0" w:color="D9E2EC"/>
-            </w:tcBorders>
+            <w:tcW w:type="dxa" w:w="6768"/>
+            <w:vAlign w:val="center"/>
           </w:tcPr>
           <w:p>
             <w:pPr>
-              <w:jc w:val="left"/>
+              <w:spacing w:after="0"/>
             </w:pPr>
             <w:r/>
             <w:r>
               <w:rPr>
-                <w:rFonts w:ascii="Aptos" w:hAnsi="Aptos"/>
-                <w:b/>
-                <w:sz w:val="19"/>
+                <w:b w:val="0"/>
               </w:rPr>
-              <w:t>Triple-barrier labeling</w:t>
-            </w:r>
-          </w:p>
-        </w:tc>
-        <w:tc>
-          <w:tcPr>
-            <w:tcW w:type="dxa" w:w="3324"/>
-            <w:shd w:fill="F8FAFC"/>
-            <w:tcBorders>
-              <w:top w:val="single" w:sz="4" w:space="0" w:color="D9E2EC"/>
-              <w:left w:val="single" w:sz="4" w:space="0" w:color="D9E2EC"/>
-              <w:bottom w:val="single" w:sz="4" w:space="0" w:color="D9E2EC"/>
-              <w:right w:val="single" w:sz="4" w:space="0" w:color="D9E2EC"/>
-            </w:tcBorders>
-          </w:tcPr>
-          <w:p>
-            <w:pPr>
-              <w:jc w:val="left"/>
-            </w:pPr>
-            <w:r/>
-            <w:r>
-              <w:rPr>
-                <w:rFonts w:ascii="Aptos" w:hAnsi="Aptos"/>
-                <w:b w:val="0"/>
-                <w:sz w:val="19"/>
-              </w:rPr>
-              <w:t>Sampled bars receive canonical event outcomes: down, exit, or up.</w:t>
-            </w:r>
-          </w:p>
-        </w:tc>
-      </w:tr>
-      <w:tr>
-        <w:tc>
-          <w:tcPr>
-            <w:tcW w:type="dxa" w:w="3324"/>
-            <w:shd w:fill="FFFFFF"/>
-            <w:tcBorders>
-              <w:top w:val="single" w:sz="4" w:space="0" w:color="D9E2EC"/>
-              <w:left w:val="single" w:sz="4" w:space="0" w:color="D9E2EC"/>
-              <w:bottom w:val="single" w:sz="4" w:space="0" w:color="D9E2EC"/>
-              <w:right w:val="single" w:sz="4" w:space="0" w:color="D9E2EC"/>
-            </w:tcBorders>
-          </w:tcPr>
-          <w:p>
-            <w:pPr>
-              <w:jc w:val="left"/>
-            </w:pPr>
-            <w:r/>
-            <w:r>
-              <w:rPr>
-                <w:rFonts w:ascii="Aptos" w:hAnsi="Aptos"/>
-                <w:b w:val="0"/>
-                <w:sz w:val="19"/>
-              </w:rPr>
-              <w:t>6</w:t>
-            </w:r>
-          </w:p>
-        </w:tc>
-        <w:tc>
-          <w:tcPr>
-            <w:tcW w:type="dxa" w:w="3324"/>
-            <w:shd w:fill="FFFFFF"/>
-            <w:tcBorders>
-              <w:top w:val="single" w:sz="4" w:space="0" w:color="D9E2EC"/>
-              <w:left w:val="single" w:sz="4" w:space="0" w:color="D9E2EC"/>
-              <w:bottom w:val="single" w:sz="4" w:space="0" w:color="D9E2EC"/>
-              <w:right w:val="single" w:sz="4" w:space="0" w:color="D9E2EC"/>
-            </w:tcBorders>
-          </w:tcPr>
-          <w:p>
-            <w:pPr>
-              <w:jc w:val="left"/>
-            </w:pPr>
-            <w:r/>
-            <w:r>
-              <w:rPr>
-                <w:rFonts w:ascii="Aptos" w:hAnsi="Aptos"/>
-                <w:b/>
-                <w:sz w:val="19"/>
-              </w:rPr>
-              <w:t>Train-only feature selection/scaling</w:t>
-            </w:r>
-          </w:p>
-        </w:tc>
-        <w:tc>
-          <w:tcPr>
-            <w:tcW w:type="dxa" w:w="3324"/>
-            <w:shd w:fill="FFFFFF"/>
-            <w:tcBorders>
-              <w:top w:val="single" w:sz="4" w:space="0" w:color="D9E2EC"/>
-              <w:left w:val="single" w:sz="4" w:space="0" w:color="D9E2EC"/>
-              <w:bottom w:val="single" w:sz="4" w:space="0" w:color="D9E2EC"/>
-              <w:right w:val="single" w:sz="4" w:space="0" w:color="D9E2EC"/>
-            </w:tcBorders>
-          </w:tcPr>
-          <w:p>
-            <w:pPr>
-              <w:jc w:val="left"/>
-            </w:pPr>
-            <w:r/>
-            <w:r>
-              <w:rPr>
-                <w:rFonts w:ascii="Aptos" w:hAnsi="Aptos"/>
-                <w:b w:val="0"/>
-                <w:sz w:val="19"/>
-              </w:rPr>
-              <w:t>Selection and scaling are fitted on the training fold, then applied to validation and test data.</w:t>
-            </w:r>
-          </w:p>
-        </w:tc>
-      </w:tr>
-      <w:tr>
-        <w:tc>
-          <w:tcPr>
-            <w:tcW w:type="dxa" w:w="3324"/>
-            <w:shd w:fill="F8FAFC"/>
-            <w:tcBorders>
-              <w:top w:val="single" w:sz="4" w:space="0" w:color="D9E2EC"/>
-              <w:left w:val="single" w:sz="4" w:space="0" w:color="D9E2EC"/>
-              <w:bottom w:val="single" w:sz="4" w:space="0" w:color="D9E2EC"/>
-              <w:right w:val="single" w:sz="4" w:space="0" w:color="D9E2EC"/>
-            </w:tcBorders>
-          </w:tcPr>
-          <w:p>
-            <w:pPr>
-              <w:jc w:val="left"/>
-            </w:pPr>
-            <w:r/>
-            <w:r>
-              <w:rPr>
-                <w:rFonts w:ascii="Aptos" w:hAnsi="Aptos"/>
-                <w:b w:val="0"/>
-                <w:sz w:val="19"/>
-              </w:rPr>
-              <w:t>7</w:t>
-            </w:r>
-          </w:p>
-        </w:tc>
-        <w:tc>
-          <w:tcPr>
-            <w:tcW w:type="dxa" w:w="3324"/>
-            <w:shd w:fill="F8FAFC"/>
-            <w:tcBorders>
-              <w:top w:val="single" w:sz="4" w:space="0" w:color="D9E2EC"/>
-              <w:left w:val="single" w:sz="4" w:space="0" w:color="D9E2EC"/>
-              <w:bottom w:val="single" w:sz="4" w:space="0" w:color="D9E2EC"/>
-              <w:right w:val="single" w:sz="4" w:space="0" w:color="D9E2EC"/>
-            </w:tcBorders>
-          </w:tcPr>
-          <w:p>
-            <w:pPr>
-              <w:jc w:val="left"/>
-            </w:pPr>
-            <w:r/>
-            <w:r>
-              <w:rPr>
-                <w:rFonts w:ascii="Aptos" w:hAnsi="Aptos"/>
-                <w:b/>
-                <w:sz w:val="19"/>
-              </w:rPr>
-              <w:t>Primary side model</w:t>
-            </w:r>
-          </w:p>
-        </w:tc>
-        <w:tc>
-          <w:tcPr>
-            <w:tcW w:type="dxa" w:w="3324"/>
-            <w:shd w:fill="F8FAFC"/>
-            <w:tcBorders>
-              <w:top w:val="single" w:sz="4" w:space="0" w:color="D9E2EC"/>
-              <w:left w:val="single" w:sz="4" w:space="0" w:color="D9E2EC"/>
-              <w:bottom w:val="single" w:sz="4" w:space="0" w:color="D9E2EC"/>
-              <w:right w:val="single" w:sz="4" w:space="0" w:color="D9E2EC"/>
-            </w:tcBorders>
-          </w:tcPr>
-          <w:p>
-            <w:pPr>
-              <w:jc w:val="left"/>
-            </w:pPr>
-            <w:r/>
-            <w:r>
-              <w:rPr>
-                <w:rFonts w:ascii="Aptos" w:hAnsi="Aptos"/>
-                <w:b w:val="0"/>
-                <w:sz w:val="19"/>
-              </w:rPr>
-              <w:t>The model learns binary side prediction on actionable down/up events.</w:t>
-            </w:r>
-          </w:p>
-        </w:tc>
-      </w:tr>
-      <w:tr>
-        <w:tc>
-          <w:tcPr>
-            <w:tcW w:type="dxa" w:w="3324"/>
-            <w:shd w:fill="FFFFFF"/>
-            <w:tcBorders>
-              <w:top w:val="single" w:sz="4" w:space="0" w:color="D9E2EC"/>
-              <w:left w:val="single" w:sz="4" w:space="0" w:color="D9E2EC"/>
-              <w:bottom w:val="single" w:sz="4" w:space="0" w:color="D9E2EC"/>
-              <w:right w:val="single" w:sz="4" w:space="0" w:color="D9E2EC"/>
-            </w:tcBorders>
-          </w:tcPr>
-          <w:p>
-            <w:pPr>
-              <w:jc w:val="left"/>
-            </w:pPr>
-            <w:r/>
-            <w:r>
-              <w:rPr>
-                <w:rFonts w:ascii="Aptos" w:hAnsi="Aptos"/>
-                <w:b w:val="0"/>
-                <w:sz w:val="19"/>
-              </w:rPr>
-              <w:t>8</w:t>
-            </w:r>
-          </w:p>
-        </w:tc>
-        <w:tc>
-          <w:tcPr>
-            <w:tcW w:type="dxa" w:w="3324"/>
-            <w:shd w:fill="FFFFFF"/>
-            <w:tcBorders>
-              <w:top w:val="single" w:sz="4" w:space="0" w:color="D9E2EC"/>
-              <w:left w:val="single" w:sz="4" w:space="0" w:color="D9E2EC"/>
-              <w:bottom w:val="single" w:sz="4" w:space="0" w:color="D9E2EC"/>
-              <w:right w:val="single" w:sz="4" w:space="0" w:color="D9E2EC"/>
-            </w:tcBorders>
-          </w:tcPr>
-          <w:p>
-            <w:pPr>
-              <w:jc w:val="left"/>
-            </w:pPr>
-            <w:r/>
-            <w:r>
-              <w:rPr>
-                <w:rFonts w:ascii="Aptos" w:hAnsi="Aptos"/>
-                <w:b/>
-                <w:sz w:val="19"/>
-              </w:rPr>
-              <w:t>Meta-label decision policy</w:t>
-            </w:r>
-          </w:p>
-        </w:tc>
-        <w:tc>
-          <w:tcPr>
-            <w:tcW w:type="dxa" w:w="3324"/>
-            <w:shd w:fill="FFFFFF"/>
-            <w:tcBorders>
-              <w:top w:val="single" w:sz="4" w:space="0" w:color="D9E2EC"/>
-              <w:left w:val="single" w:sz="4" w:space="0" w:color="D9E2EC"/>
-              <w:bottom w:val="single" w:sz="4" w:space="0" w:color="D9E2EC"/>
-              <w:right w:val="single" w:sz="4" w:space="0" w:color="D9E2EC"/>
-            </w:tcBorders>
-          </w:tcPr>
-          <w:p>
-            <w:pPr>
-              <w:jc w:val="left"/>
-            </w:pPr>
-            <w:r/>
-            <w:r>
-              <w:rPr>
-                <w:rFonts w:ascii="Aptos" w:hAnsi="Aptos"/>
-                <w:b w:val="0"/>
-                <w:sz w:val="19"/>
-              </w:rPr>
-              <w:t>A logistic meta-label model decides which side predictions should become trades.</w:t>
-            </w:r>
-          </w:p>
-        </w:tc>
-      </w:tr>
-      <w:tr>
-        <w:tc>
-          <w:tcPr>
-            <w:tcW w:type="dxa" w:w="3324"/>
-            <w:shd w:fill="F8FAFC"/>
-            <w:tcBorders>
-              <w:top w:val="single" w:sz="4" w:space="0" w:color="D9E2EC"/>
-              <w:left w:val="single" w:sz="4" w:space="0" w:color="D9E2EC"/>
-              <w:bottom w:val="single" w:sz="4" w:space="0" w:color="D9E2EC"/>
-              <w:right w:val="single" w:sz="4" w:space="0" w:color="D9E2EC"/>
-            </w:tcBorders>
-          </w:tcPr>
-          <w:p>
-            <w:pPr>
-              <w:jc w:val="left"/>
-            </w:pPr>
-            <w:r/>
-            <w:r>
-              <w:rPr>
-                <w:rFonts w:ascii="Aptos" w:hAnsi="Aptos"/>
-                <w:b w:val="0"/>
-                <w:sz w:val="19"/>
-              </w:rPr>
-              <w:t>9</w:t>
-            </w:r>
-          </w:p>
-        </w:tc>
-        <w:tc>
-          <w:tcPr>
-            <w:tcW w:type="dxa" w:w="3324"/>
-            <w:shd w:fill="F8FAFC"/>
-            <w:tcBorders>
-              <w:top w:val="single" w:sz="4" w:space="0" w:color="D9E2EC"/>
-              <w:left w:val="single" w:sz="4" w:space="0" w:color="D9E2EC"/>
-              <w:bottom w:val="single" w:sz="4" w:space="0" w:color="D9E2EC"/>
-              <w:right w:val="single" w:sz="4" w:space="0" w:color="D9E2EC"/>
-            </w:tcBorders>
-          </w:tcPr>
-          <w:p>
-            <w:pPr>
-              <w:jc w:val="left"/>
-            </w:pPr>
-            <w:r/>
-            <w:r>
-              <w:rPr>
-                <w:rFonts w:ascii="Aptos" w:hAnsi="Aptos"/>
-                <w:b/>
-                <w:sz w:val="19"/>
-              </w:rPr>
-              <w:t>Trading evaluation</w:t>
-            </w:r>
-          </w:p>
-        </w:tc>
-        <w:tc>
-          <w:tcPr>
-            <w:tcW w:type="dxa" w:w="3324"/>
-            <w:shd w:fill="F8FAFC"/>
-            <w:tcBorders>
-              <w:top w:val="single" w:sz="4" w:space="0" w:color="D9E2EC"/>
-              <w:left w:val="single" w:sz="4" w:space="0" w:color="D9E2EC"/>
-              <w:bottom w:val="single" w:sz="4" w:space="0" w:color="D9E2EC"/>
-              <w:right w:val="single" w:sz="4" w:space="0" w:color="D9E2EC"/>
-            </w:tcBorders>
-          </w:tcPr>
-          <w:p>
-            <w:pPr>
-              <w:jc w:val="left"/>
-            </w:pPr>
-            <w:r/>
-            <w:r>
-              <w:rPr>
-                <w:rFonts w:ascii="Aptos" w:hAnsi="Aptos"/>
-                <w:b w:val="0"/>
-                <w:sz w:val="19"/>
-              </w:rPr>
-              <w:t>Reports include side, meta, decision, execution, and transaction-cost-aware economics metrics.</w:t>
+              <w:t>Keep methodology decisions traceable across team members.</w:t>
             </w:r>
           </w:p>
         </w:tc>
       </w:tr>
     </w:tbl>
+    <w:p/>
     <w:p>
       <w:pPr>
         <w:pStyle w:val="Heading1"/>
       </w:pPr>
       <w:r>
         <w:rPr>
-          <w:rFonts w:ascii="Aptos Display" w:hAnsi="Aptos Display"/>
-          <w:color w:val="1F4E79"/>
+          <w:rFonts w:ascii="Aptos" w:hAnsi="Aptos" w:eastAsia="Aptos"/>
         </w:rPr>
-        <w:t>4. Leakage Controls</w:t>
-      </w:r>
-    </w:p>
-    <w:p>
-      <w:pPr>
-        <w:pStyle w:val="BodyText"/>
-      </w:pPr>
-      <w:r>
-        <w:t>The pipeline is designed to avoid fitting preprocessing decisions on validation or test data. The most important control is that training data defines the learned transformation state, while validation and test data are transformed using that state.</w:t>
+        <w:t>11. Current Limitations and Next Work</w:t>
       </w:r>
     </w:p>
     <w:p>
       <w:pPr>
         <w:pStyle w:val="ListBullet"/>
-        <w:spacing w:after="60"/>
-        <w:ind w:left="312"/>
       </w:pPr>
       <w:r>
         <w:rPr>
-          <w:rFonts w:ascii="Aptos" w:hAnsi="Aptos"/>
-          <w:sz w:val="21"/>
+          <w:rFonts w:ascii="Aptos" w:hAnsi="Aptos" w:eastAsia="Aptos"/>
         </w:rPr>
-        <w:t>Feature engineering is calculated before sampling so event bars inherit information from the same minute-level feature definitions.</w:t>
+        <w:t>Old prepared folds should be regenerated before final conclusions because timing and purge/embargo logic changed.</w:t>
       </w:r>
     </w:p>
     <w:p>
       <w:pPr>
         <w:pStyle w:val="ListBullet"/>
-        <w:spacing w:after="60"/>
-        <w:ind w:left="312"/>
       </w:pPr>
       <w:r>
         <w:rPr>
-          <w:rFonts w:ascii="Aptos" w:hAnsi="Aptos"/>
-          <w:sz w:val="21"/>
+          <w:rFonts w:ascii="Aptos" w:hAnsi="Aptos" w:eastAsia="Aptos"/>
         </w:rPr>
-        <w:t>Sampler thresholds are fitted on the training split only.</w:t>
+        <w:t>The portfolio simulator is more realistic than paper metrics, but it still does not model slippage or dynamic spreads.</w:t>
       </w:r>
     </w:p>
     <w:p>
       <w:pPr>
         <w:pStyle w:val="ListBullet"/>
-        <w:spacing w:after="60"/>
-        <w:ind w:left="312"/>
       </w:pPr>
       <w:r>
         <w:rPr>
-          <w:rFonts w:ascii="Aptos" w:hAnsi="Aptos"/>
-          <w:sz w:val="21"/>
+          <w:rFonts w:ascii="Aptos" w:hAnsi="Aptos" w:eastAsia="Aptos"/>
         </w:rPr>
-        <w:t>Feature selection and scaling are fitted on training data only and then reused for validation and test folds.</w:t>
+        <w:t>Barrier width/height should be swept for US equities instead of assuming the current defaults are optimal.</w:t>
       </w:r>
     </w:p>
     <w:p>
       <w:pPr>
         <w:pStyle w:val="ListBullet"/>
-        <w:spacing w:after="60"/>
-        <w:ind w:left="312"/>
       </w:pPr>
       <w:r>
         <w:rPr>
-          <w:rFonts w:ascii="Aptos" w:hAnsi="Aptos"/>
-          <w:sz w:val="21"/>
+          <w:rFonts w:ascii="Aptos" w:hAnsi="Aptos" w:eastAsia="Aptos"/>
         </w:rPr>
-        <w:t>Training validates the prepared artifact contract before model fitting begins.</w:t>
+        <w:t>Fixed-threshold CUSUM should be compared against tuned bars/day CUSUM on corrected folds.</w:t>
+      </w:r>
+    </w:p>
+    <w:p>
+      <w:pPr>
+        <w:pStyle w:val="ListBullet"/>
+      </w:pPr>
+      <w:r>
+        <w:rPr>
+          <w:rFonts w:ascii="Aptos" w:hAnsi="Aptos" w:eastAsia="Aptos"/>
+        </w:rPr>
+        <w:t>ResNet-LSTM, multi-seed evaluation, and probability-band baselines remain important comparison experiments.</w:t>
       </w:r>
     </w:p>
     <w:p>
@@ -1224,892 +2230,100 @@
       </w:pPr>
       <w:r>
         <w:rPr>
-          <w:rFonts w:ascii="Aptos Display" w:hAnsi="Aptos Display"/>
-          <w:color w:val="1F4E79"/>
+          <w:rFonts w:ascii="Aptos" w:hAnsi="Aptos" w:eastAsia="Aptos"/>
         </w:rPr>
-        <w:t>5. Evaluation Design</w:t>
+        <w:t>12. Useful Commands</w:t>
       </w:r>
     </w:p>
     <w:p>
       <w:pPr>
-        <w:pStyle w:val="BodyText"/>
-      </w:pPr>
-      <w:r>
-        <w:t>Evaluation is organized around the full trading decision process rather than a single aggregate score. This makes it easier to see whether errors come from side prediction, meta-label filtering, execution behavior, or transaction-cost assumptions.</w:t>
-      </w:r>
-    </w:p>
-    <w:tbl>
-      <w:tblPr>
-        <w:tblW w:type="auto" w:w="0"/>
-        <w:jc w:val="center"/>
-        <w:tblLook w:firstColumn="1" w:firstRow="1" w:lastColumn="0" w:lastRow="0" w:noHBand="0" w:noVBand="1" w:val="04A0"/>
-      </w:tblPr>
-      <w:tblGrid>
-        <w:gridCol w:w="4986"/>
-        <w:gridCol w:w="4986"/>
-      </w:tblGrid>
-      <w:tr>
-        <w:tc>
-          <w:tcPr>
-            <w:tcW w:type="dxa" w:w="4986"/>
-            <w:shd w:fill="2E5466"/>
-            <w:tcBorders>
-              <w:top w:val="single" w:sz="4" w:space="0" w:color="2E5466"/>
-              <w:left w:val="single" w:sz="4" w:space="0" w:color="2E5466"/>
-              <w:bottom w:val="single" w:sz="4" w:space="0" w:color="2E5466"/>
-              <w:right w:val="single" w:sz="4" w:space="0" w:color="2E5466"/>
-            </w:tcBorders>
-          </w:tcPr>
-          <w:p>
-            <w:pPr>
-              <w:jc w:val="left"/>
-            </w:pPr>
-            <w:r/>
-            <w:r>
-              <w:rPr>
-                <w:rFonts w:ascii="Aptos" w:hAnsi="Aptos"/>
-                <w:b/>
-                <w:color w:val="FFFFFF"/>
-                <w:sz w:val="19"/>
-              </w:rPr>
-              <w:t>Metric Group</w:t>
-            </w:r>
-          </w:p>
-        </w:tc>
-        <w:tc>
-          <w:tcPr>
-            <w:tcW w:type="dxa" w:w="4986"/>
-            <w:shd w:fill="2E5466"/>
-            <w:tcBorders>
-              <w:top w:val="single" w:sz="4" w:space="0" w:color="2E5466"/>
-              <w:left w:val="single" w:sz="4" w:space="0" w:color="2E5466"/>
-              <w:bottom w:val="single" w:sz="4" w:space="0" w:color="2E5466"/>
-              <w:right w:val="single" w:sz="4" w:space="0" w:color="2E5466"/>
-            </w:tcBorders>
-          </w:tcPr>
-          <w:p>
-            <w:pPr>
-              <w:jc w:val="left"/>
-            </w:pPr>
-            <w:r/>
-            <w:r>
-              <w:rPr>
-                <w:rFonts w:ascii="Aptos" w:hAnsi="Aptos"/>
-                <w:b/>
-                <w:color w:val="FFFFFF"/>
-                <w:sz w:val="19"/>
-              </w:rPr>
-              <w:t>What It Answers</w:t>
-            </w:r>
-          </w:p>
-        </w:tc>
-      </w:tr>
-      <w:tr>
-        <w:tc>
-          <w:tcPr>
-            <w:tcW w:type="dxa" w:w="4986"/>
-            <w:tcBorders>
-              <w:top w:val="single" w:sz="4" w:space="0" w:color="D9E2EC"/>
-              <w:left w:val="single" w:sz="4" w:space="0" w:color="D9E2EC"/>
-              <w:bottom w:val="single" w:sz="4" w:space="0" w:color="D9E2EC"/>
-              <w:right w:val="single" w:sz="4" w:space="0" w:color="D9E2EC"/>
-            </w:tcBorders>
-          </w:tcPr>
-          <w:p>
-            <w:pPr>
-              <w:jc w:val="left"/>
-            </w:pPr>
-            <w:r/>
-            <w:r>
-              <w:rPr>
-                <w:rFonts w:ascii="Aptos" w:hAnsi="Aptos"/>
-                <w:b/>
-                <w:sz w:val="19"/>
-              </w:rPr>
-              <w:t>Side model</w:t>
-            </w:r>
-          </w:p>
-        </w:tc>
-        <w:tc>
-          <w:tcPr>
-            <w:tcW w:type="dxa" w:w="4986"/>
-            <w:tcBorders>
-              <w:top w:val="single" w:sz="4" w:space="0" w:color="D9E2EC"/>
-              <w:left w:val="single" w:sz="4" w:space="0" w:color="D9E2EC"/>
-              <w:bottom w:val="single" w:sz="4" w:space="0" w:color="D9E2EC"/>
-              <w:right w:val="single" w:sz="4" w:space="0" w:color="D9E2EC"/>
-            </w:tcBorders>
-          </w:tcPr>
-          <w:p>
-            <w:pPr>
-              <w:jc w:val="left"/>
-            </w:pPr>
-            <w:r/>
-            <w:r>
-              <w:rPr>
-                <w:rFonts w:ascii="Aptos" w:hAnsi="Aptos"/>
-                <w:b w:val="0"/>
-                <w:sz w:val="19"/>
-              </w:rPr>
-              <w:t>Accuracy, balanced accuracy, class behavior before meta filtering</w:t>
-            </w:r>
-          </w:p>
-        </w:tc>
-      </w:tr>
-      <w:tr>
-        <w:tc>
-          <w:tcPr>
-            <w:tcW w:type="dxa" w:w="4986"/>
-            <w:tcBorders>
-              <w:top w:val="single" w:sz="4" w:space="0" w:color="D9E2EC"/>
-              <w:left w:val="single" w:sz="4" w:space="0" w:color="D9E2EC"/>
-              <w:bottom w:val="single" w:sz="4" w:space="0" w:color="D9E2EC"/>
-              <w:right w:val="single" w:sz="4" w:space="0" w:color="D9E2EC"/>
-            </w:tcBorders>
-          </w:tcPr>
-          <w:p>
-            <w:pPr>
-              <w:jc w:val="left"/>
-            </w:pPr>
-            <w:r/>
-            <w:r>
-              <w:rPr>
-                <w:rFonts w:ascii="Aptos" w:hAnsi="Aptos"/>
-                <w:b/>
-                <w:sz w:val="19"/>
-              </w:rPr>
-              <w:t>Meta model</w:t>
-            </w:r>
-          </w:p>
-        </w:tc>
-        <w:tc>
-          <w:tcPr>
-            <w:tcW w:type="dxa" w:w="4986"/>
-            <w:tcBorders>
-              <w:top w:val="single" w:sz="4" w:space="0" w:color="D9E2EC"/>
-              <w:left w:val="single" w:sz="4" w:space="0" w:color="D9E2EC"/>
-              <w:bottom w:val="single" w:sz="4" w:space="0" w:color="D9E2EC"/>
-              <w:right w:val="single" w:sz="4" w:space="0" w:color="D9E2EC"/>
-            </w:tcBorders>
-          </w:tcPr>
-          <w:p>
-            <w:pPr>
-              <w:jc w:val="left"/>
-            </w:pPr>
-            <w:r/>
-            <w:r>
-              <w:rPr>
-                <w:rFonts w:ascii="Aptos" w:hAnsi="Aptos"/>
-                <w:b w:val="0"/>
-                <w:sz w:val="19"/>
-              </w:rPr>
-              <w:t>Acceptance quality, TAKE probabilities, calibration-like decision behavior</w:t>
-            </w:r>
-          </w:p>
-        </w:tc>
-      </w:tr>
-      <w:tr>
-        <w:tc>
-          <w:tcPr>
-            <w:tcW w:type="dxa" w:w="4986"/>
-            <w:tcBorders>
-              <w:top w:val="single" w:sz="4" w:space="0" w:color="D9E2EC"/>
-              <w:left w:val="single" w:sz="4" w:space="0" w:color="D9E2EC"/>
-              <w:bottom w:val="single" w:sz="4" w:space="0" w:color="D9E2EC"/>
-              <w:right w:val="single" w:sz="4" w:space="0" w:color="D9E2EC"/>
-            </w:tcBorders>
-          </w:tcPr>
-          <w:p>
-            <w:pPr>
-              <w:jc w:val="left"/>
-            </w:pPr>
-            <w:r/>
-            <w:r>
-              <w:rPr>
-                <w:rFonts w:ascii="Aptos" w:hAnsi="Aptos"/>
-                <w:b/>
-                <w:sz w:val="19"/>
-              </w:rPr>
-              <w:t>Decision layer</w:t>
-            </w:r>
-          </w:p>
-        </w:tc>
-        <w:tc>
-          <w:tcPr>
-            <w:tcW w:type="dxa" w:w="4986"/>
-            <w:tcBorders>
-              <w:top w:val="single" w:sz="4" w:space="0" w:color="D9E2EC"/>
-              <w:left w:val="single" w:sz="4" w:space="0" w:color="D9E2EC"/>
-              <w:bottom w:val="single" w:sz="4" w:space="0" w:color="D9E2EC"/>
-              <w:right w:val="single" w:sz="4" w:space="0" w:color="D9E2EC"/>
-            </w:tcBorders>
-          </w:tcPr>
-          <w:p>
-            <w:pPr>
-              <w:jc w:val="left"/>
-            </w:pPr>
-            <w:r/>
-            <w:r>
-              <w:rPr>
-                <w:rFonts w:ascii="Aptos" w:hAnsi="Aptos"/>
-                <w:b w:val="0"/>
-                <w:sz w:val="19"/>
-              </w:rPr>
-              <w:t>Acted versus abstained samples and quality of accepted predictions</w:t>
-            </w:r>
-          </w:p>
-        </w:tc>
-      </w:tr>
-      <w:tr>
-        <w:tc>
-          <w:tcPr>
-            <w:tcW w:type="dxa" w:w="4986"/>
-            <w:tcBorders>
-              <w:top w:val="single" w:sz="4" w:space="0" w:color="D9E2EC"/>
-              <w:left w:val="single" w:sz="4" w:space="0" w:color="D9E2EC"/>
-              <w:bottom w:val="single" w:sz="4" w:space="0" w:color="D9E2EC"/>
-              <w:right w:val="single" w:sz="4" w:space="0" w:color="D9E2EC"/>
-            </w:tcBorders>
-          </w:tcPr>
-          <w:p>
-            <w:pPr>
-              <w:jc w:val="left"/>
-            </w:pPr>
-            <w:r/>
-            <w:r>
-              <w:rPr>
-                <w:rFonts w:ascii="Aptos" w:hAnsi="Aptos"/>
-                <w:b/>
-                <w:sz w:val="19"/>
-              </w:rPr>
-              <w:t>Execution</w:t>
-            </w:r>
-          </w:p>
-        </w:tc>
-        <w:tc>
-          <w:tcPr>
-            <w:tcW w:type="dxa" w:w="4986"/>
-            <w:tcBorders>
-              <w:top w:val="single" w:sz="4" w:space="0" w:color="D9E2EC"/>
-              <w:left w:val="single" w:sz="4" w:space="0" w:color="D9E2EC"/>
-              <w:bottom w:val="single" w:sz="4" w:space="0" w:color="D9E2EC"/>
-              <w:right w:val="single" w:sz="4" w:space="0" w:color="D9E2EC"/>
-            </w:tcBorders>
-          </w:tcPr>
-          <w:p>
-            <w:pPr>
-              <w:jc w:val="left"/>
-            </w:pPr>
-            <w:r/>
-            <w:r>
-              <w:rPr>
-                <w:rFonts w:ascii="Aptos" w:hAnsi="Aptos"/>
-                <w:b w:val="0"/>
-                <w:sz w:val="19"/>
-              </w:rPr>
-              <w:t>Long/short behavior, per-ticker breakdowns, trade frequency</w:t>
-            </w:r>
-          </w:p>
-        </w:tc>
-      </w:tr>
-      <w:tr>
-        <w:tc>
-          <w:tcPr>
-            <w:tcW w:type="dxa" w:w="4986"/>
-            <w:tcBorders>
-              <w:top w:val="single" w:sz="4" w:space="0" w:color="D9E2EC"/>
-              <w:left w:val="single" w:sz="4" w:space="0" w:color="D9E2EC"/>
-              <w:bottom w:val="single" w:sz="4" w:space="0" w:color="D9E2EC"/>
-              <w:right w:val="single" w:sz="4" w:space="0" w:color="D9E2EC"/>
-            </w:tcBorders>
-          </w:tcPr>
-          <w:p>
-            <w:pPr>
-              <w:jc w:val="left"/>
-            </w:pPr>
-            <w:r/>
-            <w:r>
-              <w:rPr>
-                <w:rFonts w:ascii="Aptos" w:hAnsi="Aptos"/>
-                <w:b/>
-                <w:sz w:val="19"/>
-              </w:rPr>
-              <w:t>Economics</w:t>
-            </w:r>
-          </w:p>
-        </w:tc>
-        <w:tc>
-          <w:tcPr>
-            <w:tcW w:type="dxa" w:w="4986"/>
-            <w:tcBorders>
-              <w:top w:val="single" w:sz="4" w:space="0" w:color="D9E2EC"/>
-              <w:left w:val="single" w:sz="4" w:space="0" w:color="D9E2EC"/>
-              <w:bottom w:val="single" w:sz="4" w:space="0" w:color="D9E2EC"/>
-              <w:right w:val="single" w:sz="4" w:space="0" w:color="D9E2EC"/>
-            </w:tcBorders>
-          </w:tcPr>
-          <w:p>
-            <w:pPr>
-              <w:jc w:val="left"/>
-            </w:pPr>
-            <w:r/>
-            <w:r>
-              <w:rPr>
-                <w:rFonts w:ascii="Aptos" w:hAnsi="Aptos"/>
-                <w:b w:val="0"/>
-                <w:sz w:val="19"/>
-              </w:rPr>
-              <w:t>Gross/net profit, transaction-cost impact, Sharpe-like and portfolio metrics</w:t>
-            </w:r>
-          </w:p>
-        </w:tc>
-      </w:tr>
-    </w:tbl>
-    <w:p>
-      <w:pPr>
-        <w:pStyle w:val="Heading1"/>
+        <w:ind w:left="360"/>
       </w:pPr>
       <w:r>
         <w:rPr>
-          <w:rFonts w:ascii="Aptos Display" w:hAnsi="Aptos Display"/>
-          <w:color w:val="1F4E79"/>
+          <w:rFonts w:ascii="Cascadia Mono" w:hAnsi="Cascadia Mono" w:eastAsia="Cascadia Mono"/>
+          <w:sz w:val="18"/>
         </w:rPr>
-        <w:t>6. Reproducibility</w:t>
+        <w:t>uv run ruff check .</w:t>
       </w:r>
     </w:p>
     <w:p>
       <w:pPr>
-        <w:pStyle w:val="BodyText"/>
+        <w:ind w:left="360"/>
       </w:pPr>
       <w:r>
-        <w:t>The cleaned project keeps source code, tests, documentation, configuration, lockfile, and reports under version control. Runtime outputs such as W&amp;B runs, generated docs, prepared folds, caches, and checkpoints are intentionally ignored so the repository stays small and reproducible.</w:t>
+        <w:rPr>
+          <w:rFonts w:ascii="Cascadia Mono" w:hAnsi="Cascadia Mono" w:eastAsia="Cascadia Mono"/>
+          <w:sz w:val="18"/>
+        </w:rPr>
+        <w:t>uv run pytest</w:t>
       </w:r>
     </w:p>
     <w:p>
       <w:pPr>
-        <w:pStyle w:val="ListBullet"/>
-        <w:spacing w:after="60"/>
-        <w:ind w:left="312"/>
+        <w:ind w:left="360"/>
       </w:pPr>
       <w:r>
         <w:rPr>
-          <w:rFonts w:ascii="Aptos" w:hAnsi="Aptos"/>
-          <w:sz w:val="21"/>
+          <w:rFonts w:ascii="Cascadia Mono" w:hAnsi="Cascadia Mono" w:eastAsia="Cascadia Mono"/>
+          <w:sz w:val="18"/>
         </w:rPr>
-        <w:t>Install and run commands through `uv` using the committed `uv.lock`.</w:t>
+        <w:t>uv run python -m kvant.ml_prepare_data.prepare_experiment</w:t>
       </w:r>
     </w:p>
     <w:p>
       <w:pPr>
-        <w:pStyle w:val="ListBullet"/>
-        <w:spacing w:after="60"/>
-        <w:ind w:left="312"/>
+        <w:ind w:left="360"/>
       </w:pPr>
       <w:r>
         <w:rPr>
-          <w:rFonts w:ascii="Aptos" w:hAnsi="Aptos"/>
-          <w:sz w:val="21"/>
+          <w:rFonts w:ascii="Cascadia Mono" w:hAnsi="Cascadia Mono" w:eastAsia="Cascadia Mono"/>
+          <w:sz w:val="18"/>
         </w:rPr>
-        <w:t>Regenerate prepared folds with `uv run python -m kvant.ml_prepare_data.prepare_experiment`.</w:t>
+        <w:t>uv run python -m kvant.ml_prepare_data.prepare_experiment --sampler fixed_cusum --cusum-h 0.01</w:t>
       </w:r>
     </w:p>
     <w:p>
       <w:pPr>
-        <w:pStyle w:val="ListBullet"/>
-        <w:spacing w:after="60"/>
-        <w:ind w:left="312"/>
+        <w:ind w:left="360"/>
       </w:pPr>
       <w:r>
         <w:rPr>
-          <w:rFonts w:ascii="Aptos" w:hAnsi="Aptos"/>
-          <w:sz w:val="21"/>
+          <w:rFonts w:ascii="Cascadia Mono" w:hAnsi="Cascadia Mono" w:eastAsia="Cascadia Mono"/>
+          <w:sz w:val="18"/>
         </w:rPr>
-        <w:t>Run training against an explicit `--exp-dir` or `--cv-manifest` after preparation.</w:t>
+        <w:t>uv run python -m kvant.ml_framework.scripts.smoke_prepared_experiment --cv-manifest src/kvant/ml_framework/prepared/sb_L_12_w180_h1.5_TBPD30_cv_manifest.json</w:t>
       </w:r>
     </w:p>
     <w:p>
       <w:pPr>
-        <w:pStyle w:val="ListBullet"/>
-        <w:spacing w:after="60"/>
-        <w:ind w:left="312"/>
+        <w:ind w:left="360"/>
       </w:pPr>
       <w:r>
         <w:rPr>
-          <w:rFonts w:ascii="Aptos" w:hAnsi="Aptos"/>
-          <w:sz w:val="21"/>
+          <w:rFonts w:ascii="Cascadia Mono" w:hAnsi="Cascadia Mono" w:eastAsia="Cascadia Mono"/>
+          <w:sz w:val="18"/>
         </w:rPr>
-        <w:t>Use `uv run pytest tests/` and `uv run ruff check .` as the main quality gates.</w:t>
+        <w:t>uv run python -m kvant.ml_framework.scripts.train_experiment --baseline --epochs 3</w:t>
       </w:r>
     </w:p>
     <w:p>
       <w:pPr>
-        <w:pStyle w:val="Heading1"/>
+        <w:ind w:left="360"/>
       </w:pPr>
       <w:r>
         <w:rPr>
-          <w:rFonts w:ascii="Aptos Display" w:hAnsi="Aptos Display"/>
-          <w:color w:val="1F4E79"/>
+          <w:rFonts w:ascii="Cascadia Mono" w:hAnsi="Cascadia Mono" w:eastAsia="Cascadia Mono"/>
+          <w:sz w:val="18"/>
         </w:rPr>
-        <w:t>7. Project Structure</w:t>
+        <w:t>uv run python -m kvant.ml_framework.scripts.train_experiment --portfolio-initial-cash 10000 --portfolio-max-position-fraction 0.05 --portfolio-max-total-exposure 1.0 --portfolio-max-positions 10</w:t>
       </w:r>
     </w:p>
-    <w:tbl>
-      <w:tblPr>
-        <w:tblW w:type="auto" w:w="0"/>
-        <w:jc w:val="center"/>
-        <w:tblLook w:firstColumn="1" w:firstRow="1" w:lastColumn="0" w:lastRow="0" w:noHBand="0" w:noVBand="1" w:val="04A0"/>
-      </w:tblPr>
-      <w:tblGrid>
-        <w:gridCol w:w="4986"/>
-        <w:gridCol w:w="4986"/>
-      </w:tblGrid>
-      <w:tr>
-        <w:tc>
-          <w:tcPr>
-            <w:tcW w:type="dxa" w:w="4986"/>
-            <w:shd w:fill="1F4E79"/>
-            <w:tcBorders>
-              <w:top w:val="single" w:sz="4" w:space="0" w:color="1F4E79"/>
-              <w:left w:val="single" w:sz="4" w:space="0" w:color="1F4E79"/>
-              <w:bottom w:val="single" w:sz="4" w:space="0" w:color="1F4E79"/>
-              <w:right w:val="single" w:sz="4" w:space="0" w:color="1F4E79"/>
-            </w:tcBorders>
-          </w:tcPr>
-          <w:p>
-            <w:pPr>
-              <w:jc w:val="left"/>
-            </w:pPr>
-            <w:r/>
-            <w:r>
-              <w:rPr>
-                <w:rFonts w:ascii="Aptos" w:hAnsi="Aptos"/>
-                <w:b/>
-                <w:color w:val="FFFFFF"/>
-                <w:sz w:val="19"/>
-              </w:rPr>
-              <w:t>Path</w:t>
-            </w:r>
-          </w:p>
-        </w:tc>
-        <w:tc>
-          <w:tcPr>
-            <w:tcW w:type="dxa" w:w="4986"/>
-            <w:shd w:fill="1F4E79"/>
-            <w:tcBorders>
-              <w:top w:val="single" w:sz="4" w:space="0" w:color="1F4E79"/>
-              <w:left w:val="single" w:sz="4" w:space="0" w:color="1F4E79"/>
-              <w:bottom w:val="single" w:sz="4" w:space="0" w:color="1F4E79"/>
-              <w:right w:val="single" w:sz="4" w:space="0" w:color="1F4E79"/>
-            </w:tcBorders>
-          </w:tcPr>
-          <w:p>
-            <w:pPr>
-              <w:jc w:val="left"/>
-            </w:pPr>
-            <w:r/>
-            <w:r>
-              <w:rPr>
-                <w:rFonts w:ascii="Aptos" w:hAnsi="Aptos"/>
-                <w:b/>
-                <w:color w:val="FFFFFF"/>
-                <w:sz w:val="19"/>
-              </w:rPr>
-              <w:t>Role</w:t>
-            </w:r>
-          </w:p>
-        </w:tc>
-      </w:tr>
-      <w:tr>
-        <w:tc>
-          <w:tcPr>
-            <w:tcW w:type="dxa" w:w="4986"/>
-            <w:tcBorders>
-              <w:top w:val="single" w:sz="4" w:space="0" w:color="D9E2EC"/>
-              <w:left w:val="single" w:sz="4" w:space="0" w:color="D9E2EC"/>
-              <w:bottom w:val="single" w:sz="4" w:space="0" w:color="D9E2EC"/>
-              <w:right w:val="single" w:sz="4" w:space="0" w:color="D9E2EC"/>
-            </w:tcBorders>
-          </w:tcPr>
-          <w:p>
-            <w:pPr>
-              <w:jc w:val="left"/>
-            </w:pPr>
-            <w:r/>
-            <w:r>
-              <w:rPr>
-                <w:rFonts w:ascii="Aptos" w:hAnsi="Aptos"/>
-                <w:b/>
-                <w:sz w:val="19"/>
-              </w:rPr>
-              <w:t>src/kvant/ml_prepare_data/</w:t>
-            </w:r>
-          </w:p>
-        </w:tc>
-        <w:tc>
-          <w:tcPr>
-            <w:tcW w:type="dxa" w:w="4986"/>
-            <w:tcBorders>
-              <w:top w:val="single" w:sz="4" w:space="0" w:color="D9E2EC"/>
-              <w:left w:val="single" w:sz="4" w:space="0" w:color="D9E2EC"/>
-              <w:bottom w:val="single" w:sz="4" w:space="0" w:color="D9E2EC"/>
-              <w:right w:val="single" w:sz="4" w:space="0" w:color="D9E2EC"/>
-            </w:tcBorders>
-          </w:tcPr>
-          <w:p>
-            <w:pPr>
-              <w:jc w:val="left"/>
-            </w:pPr>
-            <w:r/>
-            <w:r>
-              <w:rPr>
-                <w:rFonts w:ascii="Aptos" w:hAnsi="Aptos"/>
-                <w:b w:val="0"/>
-                <w:sz w:val="19"/>
-              </w:rPr>
-              <w:t>Data loading, feature engineering, sampling, labeling, reporting, and fold preparation.</w:t>
-            </w:r>
-          </w:p>
-        </w:tc>
-      </w:tr>
-      <w:tr>
-        <w:tc>
-          <w:tcPr>
-            <w:tcW w:type="dxa" w:w="4986"/>
-            <w:tcBorders>
-              <w:top w:val="single" w:sz="4" w:space="0" w:color="D9E2EC"/>
-              <w:left w:val="single" w:sz="4" w:space="0" w:color="D9E2EC"/>
-              <w:bottom w:val="single" w:sz="4" w:space="0" w:color="D9E2EC"/>
-              <w:right w:val="single" w:sz="4" w:space="0" w:color="D9E2EC"/>
-            </w:tcBorders>
-          </w:tcPr>
-          <w:p>
-            <w:pPr>
-              <w:jc w:val="left"/>
-            </w:pPr>
-            <w:r/>
-            <w:r>
-              <w:rPr>
-                <w:rFonts w:ascii="Aptos" w:hAnsi="Aptos"/>
-                <w:b/>
-                <w:sz w:val="19"/>
-              </w:rPr>
-              <w:t>src/kvant/ml_framework/</w:t>
-            </w:r>
-          </w:p>
-        </w:tc>
-        <w:tc>
-          <w:tcPr>
-            <w:tcW w:type="dxa" w:w="4986"/>
-            <w:tcBorders>
-              <w:top w:val="single" w:sz="4" w:space="0" w:color="D9E2EC"/>
-              <w:left w:val="single" w:sz="4" w:space="0" w:color="D9E2EC"/>
-              <w:bottom w:val="single" w:sz="4" w:space="0" w:color="D9E2EC"/>
-              <w:right w:val="single" w:sz="4" w:space="0" w:color="D9E2EC"/>
-            </w:tcBorders>
-          </w:tcPr>
-          <w:p>
-            <w:pPr>
-              <w:jc w:val="left"/>
-            </w:pPr>
-            <w:r/>
-            <w:r>
-              <w:rPr>
-                <w:rFonts w:ascii="Aptos" w:hAnsi="Aptos"/>
-                <w:b w:val="0"/>
-                <w:sz w:val="19"/>
-              </w:rPr>
-              <w:t>Model definitions, training scripts, decision policy, logging, and evaluation metrics.</w:t>
-            </w:r>
-          </w:p>
-        </w:tc>
-      </w:tr>
-      <w:tr>
-        <w:tc>
-          <w:tcPr>
-            <w:tcW w:type="dxa" w:w="4986"/>
-            <w:tcBorders>
-              <w:top w:val="single" w:sz="4" w:space="0" w:color="D9E2EC"/>
-              <w:left w:val="single" w:sz="4" w:space="0" w:color="D9E2EC"/>
-              <w:bottom w:val="single" w:sz="4" w:space="0" w:color="D9E2EC"/>
-              <w:right w:val="single" w:sz="4" w:space="0" w:color="D9E2EC"/>
-            </w:tcBorders>
-          </w:tcPr>
-          <w:p>
-            <w:pPr>
-              <w:jc w:val="left"/>
-            </w:pPr>
-            <w:r/>
-            <w:r>
-              <w:rPr>
-                <w:rFonts w:ascii="Aptos" w:hAnsi="Aptos"/>
-                <w:b/>
-                <w:sz w:val="19"/>
-              </w:rPr>
-              <w:t>tests/</w:t>
-            </w:r>
-          </w:p>
-        </w:tc>
-        <w:tc>
-          <w:tcPr>
-            <w:tcW w:type="dxa" w:w="4986"/>
-            <w:tcBorders>
-              <w:top w:val="single" w:sz="4" w:space="0" w:color="D9E2EC"/>
-              <w:left w:val="single" w:sz="4" w:space="0" w:color="D9E2EC"/>
-              <w:bottom w:val="single" w:sz="4" w:space="0" w:color="D9E2EC"/>
-              <w:right w:val="single" w:sz="4" w:space="0" w:color="D9E2EC"/>
-            </w:tcBorders>
-          </w:tcPr>
-          <w:p>
-            <w:pPr>
-              <w:jc w:val="left"/>
-            </w:pPr>
-            <w:r/>
-            <w:r>
-              <w:rPr>
-                <w:rFonts w:ascii="Aptos" w:hAnsi="Aptos"/>
-                <w:b w:val="0"/>
-                <w:sz w:val="19"/>
-              </w:rPr>
-              <w:t>Unit tests for data preparation, metrics, training script behavior, and logging utilities.</w:t>
-            </w:r>
-          </w:p>
-        </w:tc>
-      </w:tr>
-      <w:tr>
-        <w:tc>
-          <w:tcPr>
-            <w:tcW w:type="dxa" w:w="4986"/>
-            <w:tcBorders>
-              <w:top w:val="single" w:sz="4" w:space="0" w:color="D9E2EC"/>
-              <w:left w:val="single" w:sz="4" w:space="0" w:color="D9E2EC"/>
-              <w:bottom w:val="single" w:sz="4" w:space="0" w:color="D9E2EC"/>
-              <w:right w:val="single" w:sz="4" w:space="0" w:color="D9E2EC"/>
-            </w:tcBorders>
-          </w:tcPr>
-          <w:p>
-            <w:pPr>
-              <w:jc w:val="left"/>
-            </w:pPr>
-            <w:r/>
-            <w:r>
-              <w:rPr>
-                <w:rFonts w:ascii="Aptos" w:hAnsi="Aptos"/>
-                <w:b/>
-                <w:sz w:val="19"/>
-              </w:rPr>
-              <w:t>docs/</w:t>
-            </w:r>
-          </w:p>
-        </w:tc>
-        <w:tc>
-          <w:tcPr>
-            <w:tcW w:type="dxa" w:w="4986"/>
-            <w:tcBorders>
-              <w:top w:val="single" w:sz="4" w:space="0" w:color="D9E2EC"/>
-              <w:left w:val="single" w:sz="4" w:space="0" w:color="D9E2EC"/>
-              <w:bottom w:val="single" w:sz="4" w:space="0" w:color="D9E2EC"/>
-              <w:right w:val="single" w:sz="4" w:space="0" w:color="D9E2EC"/>
-            </w:tcBorders>
-          </w:tcPr>
-          <w:p>
-            <w:pPr>
-              <w:jc w:val="left"/>
-            </w:pPr>
-            <w:r/>
-            <w:r>
-              <w:rPr>
-                <w:rFonts w:ascii="Aptos" w:hAnsi="Aptos"/>
-                <w:b w:val="0"/>
-                <w:sz w:val="19"/>
-              </w:rPr>
-              <w:t>MkDocs documentation source and architecture-generation utilities.</w:t>
-            </w:r>
-          </w:p>
-        </w:tc>
-      </w:tr>
-      <w:tr>
-        <w:tc>
-          <w:tcPr>
-            <w:tcW w:type="dxa" w:w="4986"/>
-            <w:tcBorders>
-              <w:top w:val="single" w:sz="4" w:space="0" w:color="D9E2EC"/>
-              <w:left w:val="single" w:sz="4" w:space="0" w:color="D9E2EC"/>
-              <w:bottom w:val="single" w:sz="4" w:space="0" w:color="D9E2EC"/>
-              <w:right w:val="single" w:sz="4" w:space="0" w:color="D9E2EC"/>
-            </w:tcBorders>
-          </w:tcPr>
-          <w:p>
-            <w:pPr>
-              <w:jc w:val="left"/>
-            </w:pPr>
-            <w:r/>
-            <w:r>
-              <w:rPr>
-                <w:rFonts w:ascii="Aptos" w:hAnsi="Aptos"/>
-                <w:b/>
-                <w:sz w:val="19"/>
-              </w:rPr>
-              <w:t>reports/</w:t>
-            </w:r>
-          </w:p>
-        </w:tc>
-        <w:tc>
-          <w:tcPr>
-            <w:tcW w:type="dxa" w:w="4986"/>
-            <w:tcBorders>
-              <w:top w:val="single" w:sz="4" w:space="0" w:color="D9E2EC"/>
-              <w:left w:val="single" w:sz="4" w:space="0" w:color="D9E2EC"/>
-              <w:bottom w:val="single" w:sz="4" w:space="0" w:color="D9E2EC"/>
-              <w:right w:val="single" w:sz="4" w:space="0" w:color="D9E2EC"/>
-            </w:tcBorders>
-          </w:tcPr>
-          <w:p>
-            <w:pPr>
-              <w:jc w:val="left"/>
-            </w:pPr>
-            <w:r/>
-            <w:r>
-              <w:rPr>
-                <w:rFonts w:ascii="Aptos" w:hAnsi="Aptos"/>
-                <w:b w:val="0"/>
-                <w:sz w:val="19"/>
-              </w:rPr>
-              <w:t>Project descriptions, experiment notes, and analysis documents.</w:t>
-            </w:r>
-          </w:p>
-        </w:tc>
-      </w:tr>
-      <w:tr>
-        <w:tc>
-          <w:tcPr>
-            <w:tcW w:type="dxa" w:w="4986"/>
-            <w:tcBorders>
-              <w:top w:val="single" w:sz="4" w:space="0" w:color="D9E2EC"/>
-              <w:left w:val="single" w:sz="4" w:space="0" w:color="D9E2EC"/>
-              <w:bottom w:val="single" w:sz="4" w:space="0" w:color="D9E2EC"/>
-              <w:right w:val="single" w:sz="4" w:space="0" w:color="D9E2EC"/>
-            </w:tcBorders>
-          </w:tcPr>
-          <w:p>
-            <w:pPr>
-              <w:jc w:val="left"/>
-            </w:pPr>
-            <w:r/>
-            <w:r>
-              <w:rPr>
-                <w:rFonts w:ascii="Aptos" w:hAnsi="Aptos"/>
-                <w:b/>
-                <w:sz w:val="19"/>
-              </w:rPr>
-              <w:t>references/</w:t>
-            </w:r>
-          </w:p>
-        </w:tc>
-        <w:tc>
-          <w:tcPr>
-            <w:tcW w:type="dxa" w:w="4986"/>
-            <w:tcBorders>
-              <w:top w:val="single" w:sz="4" w:space="0" w:color="D9E2EC"/>
-              <w:left w:val="single" w:sz="4" w:space="0" w:color="D9E2EC"/>
-              <w:bottom w:val="single" w:sz="4" w:space="0" w:color="D9E2EC"/>
-              <w:right w:val="single" w:sz="4" w:space="0" w:color="D9E2EC"/>
-            </w:tcBorders>
-          </w:tcPr>
-          <w:p>
-            <w:pPr>
-              <w:jc w:val="left"/>
-            </w:pPr>
-            <w:r/>
-            <w:r>
-              <w:rPr>
-                <w:rFonts w:ascii="Aptos" w:hAnsi="Aptos"/>
-                <w:b w:val="0"/>
-                <w:sz w:val="19"/>
-              </w:rPr>
-              <w:t>Reference papers used by the project.</w:t>
-            </w:r>
-          </w:p>
-        </w:tc>
-      </w:tr>
-    </w:tbl>
-    <w:p>
-      <w:pPr>
-        <w:pStyle w:val="Heading1"/>
-      </w:pPr>
-      <w:r>
-        <w:rPr>
-          <w:rFonts w:ascii="Aptos Display" w:hAnsi="Aptos Display"/>
-          <w:color w:val="1F4E79"/>
-        </w:rPr>
-        <w:t>8. Current Status</w:t>
-      </w:r>
-    </w:p>
-    <w:p>
-      <w:pPr>
-        <w:pStyle w:val="BodyText"/>
-      </w:pPr>
-      <w:r>
-        <w:t>The project now uses a single root folder, a committed dependency lockfile, and ignored generated artifacts. The documented approach reflects the current side-plus-meta-labeling design and explicitly separates reproducible source files from regenerated outputs.</w:t>
-      </w:r>
-    </w:p>
-    <w:tbl>
-      <w:tblPr>
-        <w:tblW w:type="auto" w:w="0"/>
-        <w:jc w:val="center"/>
-        <w:tblLayout w:type="autofit"/>
-        <w:tblLook w:firstColumn="1" w:firstRow="1" w:lastColumn="0" w:lastRow="0" w:noHBand="0" w:noVBand="1" w:val="04A0"/>
-      </w:tblPr>
-      <w:tblGrid>
-        <w:gridCol w:w="9972"/>
-      </w:tblGrid>
-      <w:tr>
-        <w:tc>
-          <w:tcPr>
-            <w:tcW w:type="dxa" w:w="9972"/>
-            <w:shd w:fill="EAF3F8"/>
-            <w:tcBorders>
-              <w:top w:val="single" w:sz="4" w:space="0" w:color="B7CEDD"/>
-              <w:left w:val="single" w:sz="4" w:space="0" w:color="B7CEDD"/>
-              <w:bottom w:val="single" w:sz="4" w:space="0" w:color="B7CEDD"/>
-              <w:right w:val="single" w:sz="4" w:space="0" w:color="B7CEDD"/>
-            </w:tcBorders>
-            <w:vAlign w:val="center"/>
-          </w:tcPr>
-          <w:p>
-            <w:pPr>
-              <w:spacing w:after="60"/>
-            </w:pPr>
-            <w:r>
-              <w:rPr>
-                <w:rFonts w:ascii="Aptos Display" w:hAnsi="Aptos Display"/>
-                <w:b/>
-                <w:color w:val="1F4E79"/>
-                <w:sz w:val="22"/>
-              </w:rPr>
-              <w:t>Practical reading guide</w:t>
-            </w:r>
-          </w:p>
-          <w:p>
-            <w:pPr>
-              <w:spacing w:after="0"/>
-            </w:pPr>
-            <w:r>
-              <w:rPr>
-                <w:rFonts w:ascii="Aptos" w:hAnsi="Aptos"/>
-                <w:sz w:val="19"/>
-              </w:rPr>
-              <w:t>Read Sections 1-3 for the conceptual pipeline, Section 4 for leakage controls, Section 5 for evaluation, and Section 6 for how to reproduce the project from a clean checkout.</w:t>
-            </w:r>
-          </w:p>
-        </w:tc>
-      </w:tr>
-    </w:tbl>
-    <w:p/>
     <w:sectPr>
       <w:headerReference w:type="default" r:id="rId9"/>
       <w:footerReference w:type="default" r:id="rId10"/>
       <w:pgSz w:w="12240" w:h="15840"/>
-      <w:pgMar w:top="1020" w:right="1134" w:bottom="907" w:left="1134" w:header="720" w:footer="720" w:gutter="0"/>
+      <w:pgMar w:top="936" w:right="1080" w:bottom="936" w:left="1080" w:header="720" w:footer="720" w:gutter="0"/>
       <w:cols w:space="720"/>
       <w:docGrid w:linePitch="360"/>
     </w:sectPr>
@@ -2125,12 +2339,7 @@
       <w:jc w:val="center"/>
     </w:pPr>
     <w:r>
-      <w:rPr>
-        <w:rFonts w:ascii="Aptos" w:hAnsi="Aptos"/>
-        <w:color w:val="64748B"/>
-        <w:sz w:val="16"/>
-      </w:rPr>
-      <w:t>Short-horizon equity trading research pipeline</w:t>
+      <w:t>Research codebase - not a live trading system or investment recommendation</w:t>
     </w:r>
   </w:p>
 </w:ftr>
@@ -2144,12 +2353,7 @@
       <w:jc w:val="right"/>
     </w:pPr>
     <w:r>
-      <w:rPr>
-        <w:rFonts w:ascii="Aptos" w:hAnsi="Aptos"/>
-        <w:color w:val="64748B"/>
-        <w:sz w:val="16"/>
-      </w:rPr>
-      <w:t>Kvant Project Description</w:t>
+      <w:t>Kvant project description | updated 2026-04-27</w:t>
     </w:r>
   </w:p>
 </w:hdr>
@@ -2518,8 +2722,11 @@
     <w:name w:val="Normal"/>
     <w:qFormat/>
     <w:rsid w:val="00FC693F"/>
+    <w:pPr>
+      <w:spacing w:after="120" w:line="259" w:lineRule="auto"/>
+    </w:pPr>
     <w:rPr>
-      <w:rFonts w:ascii="Aptos" w:hAnsi="Aptos"/>
+      <w:rFonts w:ascii="Aptos" w:hAnsi="Aptos" w:eastAsia="Aptos"/>
       <w:sz w:val="21"/>
     </w:rPr>
   </w:style>
@@ -2578,14 +2785,14 @@
     <w:pPr>
       <w:keepNext/>
       <w:keepLines/>
-      <w:spacing w:before="280" w:after="120"/>
+      <w:spacing w:before="480" w:after="0"/>
       <w:outlineLvl w:val="0"/>
     </w:pPr>
     <w:rPr>
-      <w:rFonts w:asciiTheme="majorHAnsi" w:eastAsiaTheme="majorEastAsia" w:hAnsiTheme="majorHAnsi" w:cstheme="majorBidi" w:ascii="Aptos Display" w:hAnsi="Aptos Display"/>
+      <w:rFonts w:asciiTheme="majorHAnsi" w:eastAsiaTheme="majorEastAsia" w:hAnsiTheme="majorHAnsi" w:cstheme="majorBidi" w:ascii="Aptos" w:hAnsi="Aptos" w:eastAsia="Aptos"/>
       <w:b/>
       <w:bCs/>
-      <w:color w:val="365F91" w:themeColor="accent1" w:themeShade="BF"/>
+      <w:color w:val="1F4E79"/>
       <w:sz w:val="34"/>
       <w:szCs w:val="28"/>
     </w:rPr>
@@ -2602,14 +2809,14 @@
     <w:pPr>
       <w:keepNext/>
       <w:keepLines/>
-      <w:spacing w:before="200" w:after="80"/>
+      <w:spacing w:before="200" w:after="0"/>
       <w:outlineLvl w:val="1"/>
     </w:pPr>
     <w:rPr>
-      <w:rFonts w:asciiTheme="majorHAnsi" w:eastAsiaTheme="majorEastAsia" w:hAnsiTheme="majorHAnsi" w:cstheme="majorBidi" w:ascii="Aptos Display" w:hAnsi="Aptos Display"/>
+      <w:rFonts w:asciiTheme="majorHAnsi" w:eastAsiaTheme="majorEastAsia" w:hAnsiTheme="majorHAnsi" w:cstheme="majorBidi" w:ascii="Aptos" w:hAnsi="Aptos" w:eastAsia="Aptos"/>
       <w:b/>
       <w:bCs/>
-      <w:color w:val="4F81BD" w:themeColor="accent1"/>
+      <w:color w:val="2F5597"/>
       <w:sz w:val="26"/>
       <w:szCs w:val="26"/>
     </w:rPr>
@@ -2871,8 +3078,8 @@
       <w:contextualSpacing/>
     </w:pPr>
     <w:rPr>
-      <w:rFonts w:asciiTheme="majorHAnsi" w:eastAsiaTheme="majorEastAsia" w:hAnsiTheme="majorHAnsi" w:cstheme="majorBidi"/>
-      <w:color w:val="17365D" w:themeColor="text2" w:themeShade="BF"/>
+      <w:rFonts w:asciiTheme="majorHAnsi" w:eastAsiaTheme="majorEastAsia" w:hAnsiTheme="majorHAnsi" w:cstheme="majorBidi" w:ascii="Aptos Display" w:hAnsi="Aptos Display" w:eastAsia="Aptos Display"/>
+      <w:color w:val="1F4E79"/>
       <w:spacing w:val="5"/>
       <w:kern w:val="28"/>
       <w:sz w:val="52"/>
@@ -2952,12 +3159,8 @@
     <w:unhideWhenUsed/>
     <w:rsid w:val="00AA1D8D"/>
     <w:pPr>
-      <w:spacing w:after="140" w:line="259" w:lineRule="auto"/>
-    </w:pPr>
-    <w:rPr>
-      <w:rFonts w:ascii="Aptos" w:hAnsi="Aptos"/>
-      <w:sz w:val="21"/>
-    </w:rPr>
+      <w:spacing w:after="120"/>
+    </w:pPr>
   </w:style>
   <w:style w:type="character" w:customStyle="1" w:styleId="BodyTextChar">
     <w:name w:val="Body Text Char"/>

</xml_diff>